<commit_message>
docs: refresh PRD (v2) with status and work plan
</commit_message>
<xml_diff>
--- a/docs/PRD.docx
+++ b/docs/PRD.docx
@@ -142,7 +142,7 @@
           <w:sz w:val="21"/>
           <w:szCs w:val="21"/>
         </w:rPr>
-        <w:t xml:space="preserve"> v1 draft, written 3 Oct 2026</w:t>
+        <w:t xml:space="preserve"> v2, refreshed 4 Oct 2026. Implementation, tests, dashboard, evaluation script, README draft and architecture diagram are in place. Hand-labeled evaluation set, measured results, deck and video are pending.</w:t>
       </w:r>
     </w:p>
     <w:p>
@@ -750,7 +750,7 @@
                 <w:sz w:val="18"/>
                 <w:szCs w:val="18"/>
               </w:rPr>
-              <w:t xml:space="preserve"> (confirm exact format)</w:t>
+              <w:t xml:space="preserve"> (decided)</w:t>
             </w:r>
           </w:p>
         </w:tc>
@@ -979,7 +979,7 @@
                 <w:sz w:val="18"/>
                 <w:szCs w:val="18"/>
               </w:rPr>
-              <w:t xml:space="preserve">Restructure prototype into </w:t>
+              <w:t xml:space="preserve">Done: code lives under </w:t>
             </w:r>
             <w:r>
               <w:rPr>
@@ -999,7 +999,7 @@
                 <w:sz w:val="18"/>
                 <w:szCs w:val="18"/>
               </w:rPr>
-              <w:t xml:space="preserve"> (currently a root </w:t>
+              <w:t xml:space="preserve">, run with </w:t>
             </w:r>
             <w:r>
               <w:rPr>
@@ -1010,16 +1010,16 @@
                 <w:szCs w:val="16"/>
                 <w:shd w:fill="EDEDED" w:color="auto" w:val="clear"/>
               </w:rPr>
-              <w:t xml:space="preserve">riskengine/</w:t>
-            </w:r>
-            <w:r>
-              <w:rPr>
-                <w:b w:val="false"/>
-                <w:bCs w:val="false"/>
-                <w:sz w:val="18"/>
-                <w:szCs w:val="18"/>
-              </w:rPr>
-              <w:t xml:space="preserve"> package)</w:t>
+              <w:t xml:space="preserve">python -m src.app</w:t>
+            </w:r>
+            <w:r>
+              <w:rPr>
+                <w:b w:val="false"/>
+                <w:bCs w:val="false"/>
+                <w:sz w:val="18"/>
+                <w:szCs w:val="18"/>
+              </w:rPr>
+              <w:t xml:space="preserve">. README and diagram drafted; deck PDF still to add</w:t>
             </w:r>
           </w:p>
         </w:tc>
@@ -2542,7 +2542,7 @@
           <w:sz w:val="21"/>
           <w:szCs w:val="21"/>
         </w:rPr>
-        <w:t xml:space="preserve"> Python 3.11+, Flask, standard library for XML/JSON/CSV, plain HTML and JavaScript canvas for charts. </w:t>
+        <w:t xml:space="preserve"> Python 3.11+, Flask, standard library for XML/JSON/CSV, a single-file HTML dashboard with vanilla JavaScript and inline SVG charts. </w:t>
       </w:r>
       <w:r>
         <w:rPr>
@@ -6018,9 +6018,9 @@
         </w:tblBorders>
       </w:tblPr>
       <w:tblGrid>
-        <w:gridCol w:w="2845"/>
-        <w:gridCol w:w="2665"/>
-        <w:gridCol w:w="3788"/>
+        <w:gridCol w:w="2950"/>
+        <w:gridCol w:w="2588"/>
+        <w:gridCol w:w="3760"/>
       </w:tblGrid>
       <w:tr>
         <w:trPr>
@@ -6029,7 +6029,7 @@
         </w:trPr>
         <w:tc>
           <w:tcPr>
-            <w:tcW w:type="dxa" w:w="2845"/>
+            <w:tcW w:type="dxa" w:w="2950"/>
             <w:tcBorders>
               <w:top w:val="single" w:color="B8C4D4" w:sz="4"/>
               <w:left w:val="single" w:color="B8C4D4" w:sz="4"/>
@@ -6062,7 +6062,7 @@
         </w:tc>
         <w:tc>
           <w:tcPr>
-            <w:tcW w:type="dxa" w:w="2665"/>
+            <w:tcW w:type="dxa" w:w="2588"/>
             <w:tcBorders>
               <w:top w:val="single" w:color="B8C4D4" w:sz="4"/>
               <w:left w:val="single" w:color="B8C4D4" w:sz="4"/>
@@ -6095,7 +6095,7 @@
         </w:tc>
         <w:tc>
           <w:tcPr>
-            <w:tcW w:type="dxa" w:w="3788"/>
+            <w:tcW w:type="dxa" w:w="3760"/>
             <w:tcBorders>
               <w:top w:val="single" w:color="B8C4D4" w:sz="4"/>
               <w:left w:val="single" w:color="B8C4D4" w:sz="4"/>
@@ -6133,7 +6133,7 @@
         </w:trPr>
         <w:tc>
           <w:tcPr>
-            <w:tcW w:type="dxa" w:w="2845"/>
+            <w:tcW w:type="dxa" w:w="2950"/>
             <w:tcBorders>
               <w:top w:val="single" w:color="B8C4D4" w:sz="4"/>
               <w:left w:val="single" w:color="B8C4D4" w:sz="4"/>
@@ -6166,7 +6166,7 @@
         </w:tc>
         <w:tc>
           <w:tcPr>
-            <w:tcW w:type="dxa" w:w="2665"/>
+            <w:tcW w:type="dxa" w:w="2588"/>
             <w:tcBorders>
               <w:top w:val="single" w:color="B8C4D4" w:sz="4"/>
               <w:left w:val="single" w:color="B8C4D4" w:sz="4"/>
@@ -6197,7 +6197,7 @@
         </w:tc>
         <w:tc>
           <w:tcPr>
-            <w:tcW w:type="dxa" w:w="3788"/>
+            <w:tcW w:type="dxa" w:w="3760"/>
             <w:tcBorders>
               <w:top w:val="single" w:color="B8C4D4" w:sz="4"/>
               <w:left w:val="single" w:color="B8C4D4" w:sz="4"/>
@@ -6271,7 +6271,7 @@
         </w:trPr>
         <w:tc>
           <w:tcPr>
-            <w:tcW w:type="dxa" w:w="2845"/>
+            <w:tcW w:type="dxa" w:w="2950"/>
             <w:tcBorders>
               <w:top w:val="single" w:color="B8C4D4" w:sz="4"/>
               <w:left w:val="single" w:color="B8C4D4" w:sz="4"/>
@@ -6304,7 +6304,7 @@
         </w:tc>
         <w:tc>
           <w:tcPr>
-            <w:tcW w:type="dxa" w:w="2665"/>
+            <w:tcW w:type="dxa" w:w="2588"/>
             <w:tcBorders>
               <w:top w:val="single" w:color="B8C4D4" w:sz="4"/>
               <w:left w:val="single" w:color="B8C4D4" w:sz="4"/>
@@ -6335,7 +6335,7 @@
         </w:tc>
         <w:tc>
           <w:tcPr>
-            <w:tcW w:type="dxa" w:w="3788"/>
+            <w:tcW w:type="dxa" w:w="3760"/>
             <w:tcBorders>
               <w:top w:val="single" w:color="B8C4D4" w:sz="4"/>
               <w:left w:val="single" w:color="B8C4D4" w:sz="4"/>
@@ -6389,7 +6389,7 @@
         </w:trPr>
         <w:tc>
           <w:tcPr>
-            <w:tcW w:type="dxa" w:w="2845"/>
+            <w:tcW w:type="dxa" w:w="2950"/>
             <w:tcBorders>
               <w:top w:val="single" w:color="B8C4D4" w:sz="4"/>
               <w:left w:val="single" w:color="B8C4D4" w:sz="4"/>
@@ -6422,7 +6422,7 @@
         </w:tc>
         <w:tc>
           <w:tcPr>
-            <w:tcW w:type="dxa" w:w="2665"/>
+            <w:tcW w:type="dxa" w:w="2588"/>
             <w:tcBorders>
               <w:top w:val="single" w:color="B8C4D4" w:sz="4"/>
               <w:left w:val="single" w:color="B8C4D4" w:sz="4"/>
@@ -6453,7 +6453,7 @@
         </w:tc>
         <w:tc>
           <w:tcPr>
-            <w:tcW w:type="dxa" w:w="3788"/>
+            <w:tcW w:type="dxa" w:w="3760"/>
             <w:tcBorders>
               <w:top w:val="single" w:color="B8C4D4" w:sz="4"/>
               <w:left w:val="single" w:color="B8C4D4" w:sz="4"/>
@@ -6507,7 +6507,7 @@
         </w:trPr>
         <w:tc>
           <w:tcPr>
-            <w:tcW w:type="dxa" w:w="2845"/>
+            <w:tcW w:type="dxa" w:w="2950"/>
             <w:tcBorders>
               <w:top w:val="single" w:color="B8C4D4" w:sz="4"/>
               <w:left w:val="single" w:color="B8C4D4" w:sz="4"/>
@@ -6540,38 +6540,38 @@
         </w:tc>
         <w:tc>
           <w:tcPr>
-            <w:tcW w:type="dxa" w:w="2665"/>
-            <w:tcBorders>
-              <w:top w:val="single" w:color="B8C4D4" w:sz="4"/>
-              <w:left w:val="single" w:color="B8C4D4" w:sz="4"/>
-              <w:bottom w:val="single" w:color="B8C4D4" w:sz="4"/>
-              <w:right w:val="single" w:color="B8C4D4" w:sz="4"/>
-            </w:tcBorders>
-            <w:tcMar>
-              <w:top w:type="dxa" w:w="60"/>
-              <w:left w:type="dxa" w:w="90"/>
-              <w:bottom w:type="dxa" w:w="60"/>
-              <w:right w:type="dxa" w:w="90"/>
-            </w:tcMar>
-          </w:tcPr>
-          <w:p>
-            <w:pPr>
-              <w:spacing w:after="0" w:line="252"/>
-            </w:pPr>
-            <w:r>
-              <w:rPr>
-                <w:b w:val="false"/>
-                <w:bCs w:val="false"/>
-                <w:sz w:val="18"/>
-                <w:szCs w:val="18"/>
-              </w:rPr>
-              <w:t xml:space="preserve">50-100 headlines hand-labeled by the candidate with sentiment and event type</w:t>
-            </w:r>
-          </w:p>
-        </w:tc>
-        <w:tc>
-          <w:tcPr>
-            <w:tcW w:type="dxa" w:w="3788"/>
+            <w:tcW w:type="dxa" w:w="2588"/>
+            <w:tcBorders>
+              <w:top w:val="single" w:color="B8C4D4" w:sz="4"/>
+              <w:left w:val="single" w:color="B8C4D4" w:sz="4"/>
+              <w:bottom w:val="single" w:color="B8C4D4" w:sz="4"/>
+              <w:right w:val="single" w:color="B8C4D4" w:sz="4"/>
+            </w:tcBorders>
+            <w:tcMar>
+              <w:top w:type="dxa" w:w="60"/>
+              <w:left w:type="dxa" w:w="90"/>
+              <w:bottom w:type="dxa" w:w="60"/>
+              <w:right w:type="dxa" w:w="90"/>
+            </w:tcMar>
+          </w:tcPr>
+          <w:p>
+            <w:pPr>
+              <w:spacing w:after="0" w:line="252"/>
+            </w:pPr>
+            <w:r>
+              <w:rPr>
+                <w:b w:val="false"/>
+                <w:bCs w:val="false"/>
+                <w:sz w:val="18"/>
+                <w:szCs w:val="18"/>
+              </w:rPr>
+              <w:t xml:space="preserve">80-100 headlines hand-written and hand-labeled by the candidate with sentiment and event type</w:t>
+            </w:r>
+          </w:p>
+        </w:tc>
+        <w:tc>
+          <w:tcPr>
+            <w:tcW w:type="dxa" w:w="3760"/>
             <w:tcBorders>
               <w:top w:val="single" w:color="B8C4D4" w:sz="4"/>
               <w:left w:val="single" w:color="B8C4D4" w:sz="4"/>
@@ -6607,7 +6607,7 @@
         </w:trPr>
         <w:tc>
           <w:tcPr>
-            <w:tcW w:type="dxa" w:w="2845"/>
+            <w:tcW w:type="dxa" w:w="2950"/>
             <w:tcBorders>
               <w:top w:val="single" w:color="B8C4D4" w:sz="4"/>
               <w:left w:val="single" w:color="B8C4D4" w:sz="4"/>
@@ -6634,13 +6634,124 @@
                 <w:szCs w:val="16"/>
                 <w:shd w:fill="EDEDED" w:color="auto" w:val="clear"/>
               </w:rPr>
+              <w:t xml:space="preserve">docs/evaluation_results.md</w:t>
+            </w:r>
+          </w:p>
+        </w:tc>
+        <w:tc>
+          <w:tcPr>
+            <w:tcW w:type="dxa" w:w="2588"/>
+            <w:tcBorders>
+              <w:top w:val="single" w:color="B8C4D4" w:sz="4"/>
+              <w:left w:val="single" w:color="B8C4D4" w:sz="4"/>
+              <w:bottom w:val="single" w:color="B8C4D4" w:sz="4"/>
+              <w:right w:val="single" w:color="B8C4D4" w:sz="4"/>
+            </w:tcBorders>
+            <w:tcMar>
+              <w:top w:type="dxa" w:w="60"/>
+              <w:left w:type="dxa" w:w="90"/>
+              <w:bottom w:type="dxa" w:w="60"/>
+              <w:right w:type="dxa" w:w="90"/>
+            </w:tcMar>
+          </w:tcPr>
+          <w:p>
+            <w:pPr>
+              <w:spacing w:after="0" w:line="252"/>
+            </w:pPr>
+            <w:r>
+              <w:rPr>
+                <w:b w:val="false"/>
+                <w:bCs w:val="false"/>
+                <w:sz w:val="18"/>
+                <w:szCs w:val="18"/>
+              </w:rPr>
+              <w:t xml:space="preserve">Accuracy, macro-F1 and error analysis from </w:t>
+            </w:r>
+            <w:r>
+              <w:rPr>
+                <w:rFonts w:ascii="Consolas" w:cs="Consolas" w:eastAsia="Consolas" w:hAnsi="Consolas"/>
+                <w:b w:val="false"/>
+                <w:bCs w:val="false"/>
+                <w:sz w:val="16"/>
+                <w:szCs w:val="16"/>
+                <w:shd w:fill="EDEDED" w:color="auto" w:val="clear"/>
+              </w:rPr>
+              <w:t xml:space="preserve">python -m src.evaluate</w:t>
+            </w:r>
+          </w:p>
+        </w:tc>
+        <w:tc>
+          <w:tcPr>
+            <w:tcW w:type="dxa" w:w="3760"/>
+            <w:tcBorders>
+              <w:top w:val="single" w:color="B8C4D4" w:sz="4"/>
+              <w:left w:val="single" w:color="B8C4D4" w:sz="4"/>
+              <w:bottom w:val="single" w:color="B8C4D4" w:sz="4"/>
+              <w:right w:val="single" w:color="B8C4D4" w:sz="4"/>
+            </w:tcBorders>
+            <w:tcMar>
+              <w:top w:type="dxa" w:w="60"/>
+              <w:left w:type="dxa" w:w="90"/>
+              <w:bottom w:type="dxa" w:w="60"/>
+              <w:right w:type="dxa" w:w="90"/>
+            </w:tcMar>
+          </w:tcPr>
+          <w:p>
+            <w:pPr>
+              <w:spacing w:after="0" w:line="252"/>
+            </w:pPr>
+            <w:r>
+              <w:rPr>
+                <w:b w:val="false"/>
+                <w:bCs w:val="false"/>
+                <w:sz w:val="18"/>
+                <w:szCs w:val="18"/>
+              </w:rPr>
+              <w:t xml:space="preserve">Generated from the labeled file</w:t>
+            </w:r>
+          </w:p>
+        </w:tc>
+      </w:tr>
+      <w:tr>
+        <w:trPr>
+          <w:cantSplit/>
+        </w:trPr>
+        <w:tc>
+          <w:tcPr>
+            <w:tcW w:type="dxa" w:w="2950"/>
+            <w:tcBorders>
+              <w:top w:val="single" w:color="B8C4D4" w:sz="4"/>
+              <w:left w:val="single" w:color="B8C4D4" w:sz="4"/>
+              <w:bottom w:val="single" w:color="B8C4D4" w:sz="4"/>
+              <w:right w:val="single" w:color="B8C4D4" w:sz="4"/>
+            </w:tcBorders>
+            <w:tcMar>
+              <w:top w:type="dxa" w:w="60"/>
+              <w:left w:type="dxa" w:w="90"/>
+              <w:bottom w:type="dxa" w:w="60"/>
+              <w:right w:type="dxa" w:w="90"/>
+            </w:tcMar>
+          </w:tcPr>
+          <w:p>
+            <w:pPr>
+              <w:spacing w:after="0" w:line="252"/>
+            </w:pPr>
+            <w:r>
+              <w:rPr>
+                <w:rFonts w:ascii="Consolas" w:cs="Consolas" w:eastAsia="Consolas" w:hAnsi="Consolas"/>
+                <w:b w:val="false"/>
+                <w:bCs w:val="false"/>
+                <w:sz w:val="16"/>
+                <w:szCs w:val="16"/>
+                <w:shd w:fill="EDEDED" w:color="auto" w:val="clear"/>
+              </w:rPr>
               <w:t xml:space="preserve">data/signals.jsonl</w:t>
             </w:r>
           </w:p>
         </w:tc>
         <w:tc>
           <w:tcPr>
-            <w:tcW w:type="dxa" w:w="2665"/>
+            <w:tcW w:type="dxa" w:w="2588"/>
             <w:tcBorders>
               <w:top w:val="single" w:color="B8C4D4" w:sz="4"/>
               <w:left w:val="single" w:color="B8C4D4" w:sz="4"/>
@@ -6671,7 +6782,7 @@
         </w:tc>
         <w:tc>
           <w:tcPr>
-            <w:tcW w:type="dxa" w:w="3788"/>
+            <w:tcW w:type="dxa" w:w="3760"/>
             <w:tcBorders>
               <w:top w:val="single" w:color="B8C4D4" w:sz="4"/>
               <w:left w:val="single" w:color="B8C4D4" w:sz="4"/>
@@ -10379,35 +10490,7 @@
           <w:sz w:val="30"/>
           <w:szCs w:val="30"/>
         </w:rPr>
-        <w:t xml:space="preserve">11. Current prototype status (honest snapshot)</w:t>
-      </w:r>
-    </w:p>
-    <w:p>
-      <w:pPr>
-        <w:spacing w:after="90"/>
-      </w:pPr>
-      <w:r>
-        <w:rPr>
-          <w:sz w:val="21"/>
-          <w:szCs w:val="21"/>
-        </w:rPr>
-        <w:t xml:space="preserve">Location in the sandbox: </w:t>
-      </w:r>
-      <w:r>
-        <w:rPr>
-          <w:rFonts w:ascii="Consolas" w:cs="Consolas" w:eastAsia="Consolas" w:hAnsi="Consolas"/>
-          <w:sz w:val="19"/>
-          <w:szCs w:val="19"/>
-          <w:shd w:fill="EDEDED" w:color="auto" w:val="clear"/>
-        </w:rPr>
-        <w:t xml:space="preserve">/home/claude/risk-engine</w:t>
-      </w:r>
-      <w:r>
-        <w:rPr>
-          <w:sz w:val="21"/>
-          <w:szCs w:val="21"/>
-        </w:rPr>
-        <w:t xml:space="preserve">. Not a git repo yet.</w:t>
+        <w:t xml:space="preserve">11. Current project status (honest snapshot, 4 Oct 2026)</w:t>
       </w:r>
     </w:p>
     <w:tbl>
@@ -10529,7 +10612,7 @@
                 <w:sz w:val="18"/>
                 <w:szCs w:val="18"/>
               </w:rPr>
-              <w:t xml:space="preserve">Lexicon, NLP analysis, ingestion, pipeline</w:t>
+              <w:t xml:space="preserve">NLP Risk Engine (lexicon, analysis, ingestion, pipeline)</w:t>
             </w:r>
           </w:p>
         </w:tc>
@@ -10560,7 +10643,7 @@
                 <w:sz w:val="18"/>
                 <w:szCs w:val="18"/>
               </w:rPr>
-              <w:t xml:space="preserve">Written and run; produced 53 signals (24 news, 29 social) with sensible output</w:t>
+              <w:t xml:space="preserve">Built and tested; 53 sample signals (24 news, 29 social) with sensible output</w:t>
             </w:r>
           </w:p>
         </w:tc>
@@ -10596,7 +10679,7 @@
                 <w:sz w:val="18"/>
                 <w:szCs w:val="18"/>
               </w:rPr>
-              <w:t xml:space="preserve">Rebalancer</w:t>
+              <w:t xml:space="preserve">Module A: rebalancer</w:t>
             </w:r>
           </w:p>
         </w:tc>
@@ -10627,7 +10710,7 @@
                 <w:sz w:val="18"/>
                 <w:szCs w:val="18"/>
               </w:rPr>
-              <w:t xml:space="preserve">Written and run; weights sum to 1, bounds respected</w:t>
+              <w:t xml:space="preserve">Built and tested; weights sum to 1 and respect the 2%-15% bounds</w:t>
             </w:r>
           </w:p>
         </w:tc>
@@ -10663,7 +10746,7 @@
                 <w:sz w:val="18"/>
                 <w:szCs w:val="18"/>
               </w:rPr>
-              <w:t xml:space="preserve">Stress tester + portfolio</w:t>
+              <w:t xml:space="preserve">Module B: stress tester and portfolio</w:t>
             </w:r>
           </w:p>
         </w:tc>
@@ -10694,7 +10777,7 @@
                 <w:sz w:val="18"/>
                 <w:szCs w:val="18"/>
               </w:rPr>
-              <w:t xml:space="preserve">Written and run; derivative sign errors found and fixed</w:t>
+              <w:t xml:space="preserve">Built and tested; positions hand-checked against the code, derivative signs verified</w:t>
             </w:r>
           </w:p>
         </w:tc>
@@ -10725,23 +10808,12 @@
             </w:pPr>
             <w:r>
               <w:rPr>
-                <w:rFonts w:ascii="Consolas" w:cs="Consolas" w:eastAsia="Consolas" w:hAnsi="Consolas"/>
-                <w:b w:val="false"/>
-                <w:bCs w:val="false"/>
-                <w:sz w:val="16"/>
-                <w:szCs w:val="16"/>
-                <w:shd w:fill="EDEDED" w:color="auto" w:val="clear"/>
-              </w:rPr>
-              <w:t xml:space="preserve">app.py</w:t>
-            </w:r>
-            <w:r>
-              <w:rPr>
-                <w:b w:val="false"/>
-                <w:bCs w:val="false"/>
-                <w:sz w:val="18"/>
-                <w:szCs w:val="18"/>
-              </w:rPr>
-              <w:t xml:space="preserve"> (Flask API)</w:t>
+                <w:b w:val="false"/>
+                <w:bCs w:val="false"/>
+                <w:sz w:val="18"/>
+                <w:szCs w:val="18"/>
+              </w:rPr>
+              <w:t xml:space="preserve">Flask API</w:t>
             </w:r>
           </w:p>
         </w:tc>
@@ -10772,16 +10844,7 @@
                 <w:sz w:val="18"/>
                 <w:szCs w:val="18"/>
               </w:rPr>
-              <w:t xml:space="preserve">Written, </w:t>
-            </w:r>
-            <w:r>
-              <w:rPr>
-                <w:b/>
-                <w:bCs/>
-                <w:sz w:val="18"/>
-                <w:szCs w:val="18"/>
-              </w:rPr>
-              <w:t xml:space="preserve">not yet run</w:t>
+              <w:t xml:space="preserve">Built; every endpoint exercised, including bad-input cases</w:t>
             </w:r>
           </w:p>
         </w:tc>
@@ -10812,6 +10875,15 @@
             </w:pPr>
             <w:r>
               <w:rPr>
+                <w:b w:val="false"/>
+                <w:bCs w:val="false"/>
+                <w:sz w:val="18"/>
+                <w:szCs w:val="18"/>
+              </w:rPr>
+              <w:t xml:space="preserve">Dashboard (</w:t>
+            </w:r>
+            <w:r>
+              <w:rPr>
                 <w:rFonts w:ascii="Consolas" w:cs="Consolas" w:eastAsia="Consolas" w:hAnsi="Consolas"/>
                 <w:b w:val="false"/>
                 <w:bCs w:val="false"/>
@@ -10819,7 +10891,16 @@
                 <w:szCs w:val="16"/>
                 <w:shd w:fill="EDEDED" w:color="auto" w:val="clear"/>
               </w:rPr>
-              <w:t xml:space="preserve">templates/dashboard.html</w:t>
+              <w:t xml:space="preserve">src/templates/dashboard.html</w:t>
+            </w:r>
+            <w:r>
+              <w:rPr>
+                <w:b w:val="false"/>
+                <w:bCs w:val="false"/>
+                <w:sz w:val="18"/>
+                <w:szCs w:val="18"/>
+              </w:rPr>
+              <w:t xml:space="preserve">)</w:t>
             </w:r>
           </w:p>
         </w:tc>
@@ -10845,12 +10926,12 @@
             </w:pPr>
             <w:r>
               <w:rPr>
-                <w:b/>
-                <w:bCs/>
-                <w:sz w:val="18"/>
-                <w:szCs w:val="18"/>
-              </w:rPr>
-              <w:t xml:space="preserve">Not written</w:t>
+                <w:b w:val="false"/>
+                <w:bCs w:val="false"/>
+                <w:sz w:val="18"/>
+                <w:szCs w:val="18"/>
+              </w:rPr>
+              <w:t xml:space="preserve">Built: KPIs, signal feed, Module A chart with slider, Module B stress view, live analyze box</w:t>
             </w:r>
           </w:p>
         </w:tc>
@@ -10886,47 +10967,7 @@
                 <w:sz w:val="18"/>
                 <w:szCs w:val="18"/>
               </w:rPr>
-              <w:t xml:space="preserve">Unit tests, </w:t>
-            </w:r>
-            <w:r>
-              <w:rPr>
-                <w:rFonts w:ascii="Consolas" w:cs="Consolas" w:eastAsia="Consolas" w:hAnsi="Consolas"/>
-                <w:b w:val="false"/>
-                <w:bCs w:val="false"/>
-                <w:sz w:val="16"/>
-                <w:szCs w:val="16"/>
-                <w:shd w:fill="EDEDED" w:color="auto" w:val="clear"/>
-              </w:rPr>
-              <w:t xml:space="preserve">requirements.txt</w:t>
-            </w:r>
-            <w:r>
-              <w:rPr>
-                <w:b w:val="false"/>
-                <w:bCs w:val="false"/>
-                <w:sz w:val="18"/>
-                <w:szCs w:val="18"/>
-              </w:rPr>
-              <w:t xml:space="preserve">, </w:t>
-            </w:r>
-            <w:r>
-              <w:rPr>
-                <w:rFonts w:ascii="Consolas" w:cs="Consolas" w:eastAsia="Consolas" w:hAnsi="Consolas"/>
-                <w:b w:val="false"/>
-                <w:bCs w:val="false"/>
-                <w:sz w:val="16"/>
-                <w:szCs w:val="16"/>
-                <w:shd w:fill="EDEDED" w:color="auto" w:val="clear"/>
-              </w:rPr>
-              <w:t xml:space="preserve">LICENSE</w:t>
-            </w:r>
-            <w:r>
-              <w:rPr>
-                <w:b w:val="false"/>
-                <w:bCs w:val="false"/>
-                <w:sz w:val="18"/>
-                <w:szCs w:val="18"/>
-              </w:rPr>
-              <w:t xml:space="preserve">, README, architecture diagram, deck</w:t>
+              <w:t xml:space="preserve">Unit tests</w:t>
             </w:r>
           </w:p>
         </w:tc>
@@ -10952,12 +10993,12 @@
             </w:pPr>
             <w:r>
               <w:rPr>
-                <w:b/>
-                <w:bCs/>
-                <w:sz w:val="18"/>
-                <w:szCs w:val="18"/>
-              </w:rPr>
-              <w:t xml:space="preserve">Not started</w:t>
+                <w:b w:val="false"/>
+                <w:bCs w:val="false"/>
+                <w:sz w:val="18"/>
+                <w:szCs w:val="18"/>
+              </w:rPr>
+              <w:t xml:space="preserve">117 tests passing at the last run, offline, no data file modified</w:t>
             </w:r>
           </w:p>
         </w:tc>
@@ -10993,7 +11034,27 @@
                 <w:sz w:val="18"/>
                 <w:szCs w:val="18"/>
               </w:rPr>
-              <w:t xml:space="preserve">Live RSS / Reddit fetch</w:t>
+              <w:t xml:space="preserve">Evaluation script (</w:t>
+            </w:r>
+            <w:r>
+              <w:rPr>
+                <w:rFonts w:ascii="Consolas" w:cs="Consolas" w:eastAsia="Consolas" w:hAnsi="Consolas"/>
+                <w:b w:val="false"/>
+                <w:bCs w:val="false"/>
+                <w:sz w:val="16"/>
+                <w:szCs w:val="16"/>
+                <w:shd w:fill="EDEDED" w:color="auto" w:val="clear"/>
+              </w:rPr>
+              <w:t xml:space="preserve">src/evaluate.py</w:t>
+            </w:r>
+            <w:r>
+              <w:rPr>
+                <w:b w:val="false"/>
+                <w:bCs w:val="false"/>
+                <w:sz w:val="18"/>
+                <w:szCs w:val="18"/>
+              </w:rPr>
+              <w:t xml:space="preserve">)</w:t>
             </w:r>
           </w:p>
         </w:tc>
@@ -11017,6 +11078,15 @@
             <w:pPr>
               <w:spacing w:after="0" w:line="252"/>
             </w:pPr>
+            <w:r>
+              <w:rPr>
+                <w:b w:val="false"/>
+                <w:bCs w:val="false"/>
+                <w:sz w:val="18"/>
+                <w:szCs w:val="18"/>
+              </w:rPr>
+              <w:t xml:space="preserve">Built and tested on synthetic data; </w:t>
+            </w:r>
             <w:r>
               <w:rPr>
                 <w:b/>
@@ -11024,16 +11094,7 @@
                 <w:sz w:val="18"/>
                 <w:szCs w:val="18"/>
               </w:rPr>
-              <w:t xml:space="preserve">Untested</w:t>
-            </w:r>
-            <w:r>
-              <w:rPr>
-                <w:b w:val="false"/>
-                <w:bCs w:val="false"/>
-                <w:sz w:val="18"/>
-                <w:szCs w:val="18"/>
-              </w:rPr>
-              <w:t xml:space="preserve"> (no network in the sandbox); fallback exists</w:t>
+              <w:t xml:space="preserve">needs the hand-labeled file to produce real numbers</w:t>
             </w:r>
           </w:p>
         </w:tc>
@@ -11069,7 +11130,7 @@
                 <w:sz w:val="18"/>
                 <w:szCs w:val="18"/>
               </w:rPr>
-              <w:t xml:space="preserve">Evaluation set and measured metrics</w:t>
+              <w:t xml:space="preserve">Git history</w:t>
             </w:r>
           </w:p>
         </w:tc>
@@ -11095,12 +11156,12 @@
             </w:pPr>
             <w:r>
               <w:rPr>
-                <w:b/>
-                <w:bCs/>
-                <w:sz w:val="18"/>
-                <w:szCs w:val="18"/>
-              </w:rPr>
-              <w:t xml:space="preserve">Not started</w:t>
+                <w:b w:val="false"/>
+                <w:bCs w:val="false"/>
+                <w:sz w:val="18"/>
+                <w:szCs w:val="18"/>
+              </w:rPr>
+              <w:t xml:space="preserve">Repository initialised with 10 staged commits; fresh-clone test passed</w:t>
             </w:r>
           </w:p>
         </w:tc>
@@ -11136,27 +11197,7 @@
                 <w:sz w:val="18"/>
                 <w:szCs w:val="18"/>
               </w:rPr>
-              <w:t xml:space="preserve">Layout vs. required </w:t>
-            </w:r>
-            <w:r>
-              <w:rPr>
-                <w:rFonts w:ascii="Consolas" w:cs="Consolas" w:eastAsia="Consolas" w:hAnsi="Consolas"/>
-                <w:b w:val="false"/>
-                <w:bCs w:val="false"/>
-                <w:sz w:val="16"/>
-                <w:szCs w:val="16"/>
-                <w:shd w:fill="EDEDED" w:color="auto" w:val="clear"/>
-              </w:rPr>
-              <w:t xml:space="preserve">src/</w:t>
-            </w:r>
-            <w:r>
-              <w:rPr>
-                <w:b w:val="false"/>
-                <w:bCs w:val="false"/>
-                <w:sz w:val="18"/>
-                <w:szCs w:val="18"/>
-              </w:rPr>
-              <w:t xml:space="preserve"> structure</w:t>
+              <w:t xml:space="preserve">Live RSS fetch</w:t>
             </w:r>
           </w:p>
         </w:tc>
@@ -11187,7 +11228,208 @@
                 <w:sz w:val="18"/>
                 <w:szCs w:val="18"/>
               </w:rPr>
-              <w:t xml:space="preserve">Needs restructuring</w:t>
+              <w:t xml:space="preserve">Works (returns live headlines, which are noisy). Reddit's public endpoint returned HTTP 403, so the demo's social source is the simulated sample file</w:t>
+            </w:r>
+          </w:p>
+        </w:tc>
+      </w:tr>
+      <w:tr>
+        <w:trPr>
+          <w:cantSplit/>
+        </w:trPr>
+        <w:tc>
+          <w:tcPr>
+            <w:tcW w:type="dxa" w:w="4649"/>
+            <w:tcBorders>
+              <w:top w:val="single" w:color="B8C4D4" w:sz="4"/>
+              <w:left w:val="single" w:color="B8C4D4" w:sz="4"/>
+              <w:bottom w:val="single" w:color="B8C4D4" w:sz="4"/>
+              <w:right w:val="single" w:color="B8C4D4" w:sz="4"/>
+            </w:tcBorders>
+            <w:tcMar>
+              <w:top w:type="dxa" w:w="60"/>
+              <w:left w:type="dxa" w:w="90"/>
+              <w:bottom w:type="dxa" w:w="60"/>
+              <w:right w:type="dxa" w:w="90"/>
+            </w:tcMar>
+          </w:tcPr>
+          <w:p>
+            <w:pPr>
+              <w:spacing w:after="0" w:line="252"/>
+            </w:pPr>
+            <w:r>
+              <w:rPr>
+                <w:b w:val="false"/>
+                <w:bCs w:val="false"/>
+                <w:sz w:val="18"/>
+                <w:szCs w:val="18"/>
+              </w:rPr>
+              <w:t xml:space="preserve">README and architecture diagram</w:t>
+            </w:r>
+          </w:p>
+        </w:tc>
+        <w:tc>
+          <w:tcPr>
+            <w:tcW w:type="dxa" w:w="4649"/>
+            <w:tcBorders>
+              <w:top w:val="single" w:color="B8C4D4" w:sz="4"/>
+              <w:left w:val="single" w:color="B8C4D4" w:sz="4"/>
+              <w:bottom w:val="single" w:color="B8C4D4" w:sz="4"/>
+              <w:right w:val="single" w:color="B8C4D4" w:sz="4"/>
+            </w:tcBorders>
+            <w:tcMar>
+              <w:top w:type="dxa" w:w="60"/>
+              <w:left w:type="dxa" w:w="90"/>
+              <w:bottom w:type="dxa" w:w="60"/>
+              <w:right w:type="dxa" w:w="90"/>
+            </w:tcMar>
+          </w:tcPr>
+          <w:p>
+            <w:pPr>
+              <w:spacing w:after="0" w:line="252"/>
+            </w:pPr>
+            <w:r>
+              <w:rPr>
+                <w:b w:val="false"/>
+                <w:bCs w:val="false"/>
+                <w:sz w:val="18"/>
+                <w:szCs w:val="18"/>
+              </w:rPr>
+              <w:t xml:space="preserve">Drafted; evaluation numbers and video link still to fill</w:t>
+            </w:r>
+          </w:p>
+        </w:tc>
+      </w:tr>
+      <w:tr>
+        <w:trPr>
+          <w:cantSplit/>
+        </w:trPr>
+        <w:tc>
+          <w:tcPr>
+            <w:tcW w:type="dxa" w:w="4649"/>
+            <w:tcBorders>
+              <w:top w:val="single" w:color="B8C4D4" w:sz="4"/>
+              <w:left w:val="single" w:color="B8C4D4" w:sz="4"/>
+              <w:bottom w:val="single" w:color="B8C4D4" w:sz="4"/>
+              <w:right w:val="single" w:color="B8C4D4" w:sz="4"/>
+            </w:tcBorders>
+            <w:tcMar>
+              <w:top w:type="dxa" w:w="60"/>
+              <w:left w:type="dxa" w:w="90"/>
+              <w:bottom w:type="dxa" w:w="60"/>
+              <w:right w:type="dxa" w:w="90"/>
+            </w:tcMar>
+          </w:tcPr>
+          <w:p>
+            <w:pPr>
+              <w:spacing w:after="0" w:line="252"/>
+            </w:pPr>
+            <w:r>
+              <w:rPr>
+                <w:b w:val="false"/>
+                <w:bCs w:val="false"/>
+                <w:sz w:val="18"/>
+                <w:szCs w:val="18"/>
+              </w:rPr>
+              <w:t xml:space="preserve">Hand-labeled evaluation set and measured metrics</w:t>
+            </w:r>
+          </w:p>
+        </w:tc>
+        <w:tc>
+          <w:tcPr>
+            <w:tcW w:type="dxa" w:w="4649"/>
+            <w:tcBorders>
+              <w:top w:val="single" w:color="B8C4D4" w:sz="4"/>
+              <w:left w:val="single" w:color="B8C4D4" w:sz="4"/>
+              <w:bottom w:val="single" w:color="B8C4D4" w:sz="4"/>
+              <w:right w:val="single" w:color="B8C4D4" w:sz="4"/>
+            </w:tcBorders>
+            <w:tcMar>
+              <w:top w:type="dxa" w:w="60"/>
+              <w:left w:type="dxa" w:w="90"/>
+              <w:bottom w:type="dxa" w:w="60"/>
+              <w:right w:type="dxa" w:w="90"/>
+            </w:tcMar>
+          </w:tcPr>
+          <w:p>
+            <w:pPr>
+              <w:spacing w:after="0" w:line="252"/>
+            </w:pPr>
+            <w:r>
+              <w:rPr>
+                <w:b/>
+                <w:bCs/>
+                <w:sz w:val="18"/>
+                <w:szCs w:val="18"/>
+              </w:rPr>
+              <w:t xml:space="preserve">Not done</w:t>
+            </w:r>
+          </w:p>
+        </w:tc>
+      </w:tr>
+      <w:tr>
+        <w:trPr>
+          <w:cantSplit/>
+        </w:trPr>
+        <w:tc>
+          <w:tcPr>
+            <w:tcW w:type="dxa" w:w="4649"/>
+            <w:tcBorders>
+              <w:top w:val="single" w:color="B8C4D4" w:sz="4"/>
+              <w:left w:val="single" w:color="B8C4D4" w:sz="4"/>
+              <w:bottom w:val="single" w:color="B8C4D4" w:sz="4"/>
+              <w:right w:val="single" w:color="B8C4D4" w:sz="4"/>
+            </w:tcBorders>
+            <w:tcMar>
+              <w:top w:type="dxa" w:w="60"/>
+              <w:left w:type="dxa" w:w="90"/>
+              <w:bottom w:type="dxa" w:w="60"/>
+              <w:right w:type="dxa" w:w="90"/>
+            </w:tcMar>
+          </w:tcPr>
+          <w:p>
+            <w:pPr>
+              <w:spacing w:after="0" w:line="252"/>
+            </w:pPr>
+            <w:r>
+              <w:rPr>
+                <w:b w:val="false"/>
+                <w:bCs w:val="false"/>
+                <w:sz w:val="18"/>
+                <w:szCs w:val="18"/>
+              </w:rPr>
+              <w:t xml:space="preserve">Deck (PDF), demo video, final submission</w:t>
+            </w:r>
+          </w:p>
+        </w:tc>
+        <w:tc>
+          <w:tcPr>
+            <w:tcW w:type="dxa" w:w="4649"/>
+            <w:tcBorders>
+              <w:top w:val="single" w:color="B8C4D4" w:sz="4"/>
+              <w:left w:val="single" w:color="B8C4D4" w:sz="4"/>
+              <w:bottom w:val="single" w:color="B8C4D4" w:sz="4"/>
+              <w:right w:val="single" w:color="B8C4D4" w:sz="4"/>
+            </w:tcBorders>
+            <w:tcMar>
+              <w:top w:type="dxa" w:w="60"/>
+              <w:left w:type="dxa" w:w="90"/>
+              <w:bottom w:type="dxa" w:w="60"/>
+              <w:right w:type="dxa" w:w="90"/>
+            </w:tcMar>
+          </w:tcPr>
+          <w:p>
+            <w:pPr>
+              <w:spacing w:after="0" w:line="252"/>
+            </w:pPr>
+            <w:r>
+              <w:rPr>
+                <w:b/>
+                <w:bCs/>
+                <w:sz w:val="18"/>
+                <w:szCs w:val="18"/>
+              </w:rPr>
+              <w:t xml:space="preserve">Not done</w:t>
             </w:r>
           </w:p>
         </w:tc>
@@ -11204,10 +11446,97 @@
       </w:pPr>
       <w:r>
         <w:rPr>
-          <w:sz w:val="21"/>
-          <w:szCs w:val="21"/>
-        </w:rPr>
-        <w:t xml:space="preserve">Known cleanups: remove leftover logic noise in the rebalancer, add edge-case tests, confirm Python version compatibility on your machine.</w:t>
+          <w:b/>
+          <w:bCs/>
+          <w:sz w:val="21"/>
+          <w:szCs w:val="21"/>
+        </w:rPr>
+        <w:t xml:space="preserve">Known limitations to disclose (not hidden):</w:t>
+      </w:r>
+    </w:p>
+    <w:p>
+      <w:pPr>
+        <w:pStyle w:val="ListParagraph"/>
+        <w:numPr>
+          <w:ilvl w:val="0"/>
+          <w:numId w:val="2"/>
+        </w:numPr>
+        <w:spacing w:after="60"/>
+      </w:pPr>
+      <w:r>
+        <w:rPr>
+          <w:sz w:val="21"/>
+          <w:szCs w:val="21"/>
+        </w:rPr>
+        <w:t xml:space="preserve">Analyst "downgrade" headlines can be mislabeled as Credit Events (a credit-rating downgrade and an analyst stock downgrade are different things).</w:t>
+      </w:r>
+    </w:p>
+    <w:p>
+      <w:pPr>
+        <w:pStyle w:val="ListParagraph"/>
+        <w:numPr>
+          <w:ilvl w:val="0"/>
+          <w:numId w:val="2"/>
+        </w:numPr>
+        <w:spacing w:after="60"/>
+      </w:pPr>
+      <w:r>
+        <w:rPr>
+          <w:sz w:val="21"/>
+          <w:szCs w:val="21"/>
+        </w:rPr>
+        <w:t xml:space="preserve">Double negatives ("not extremely weak") flip to positive; sarcasm is not detected.</w:t>
+      </w:r>
+    </w:p>
+    <w:p>
+      <w:pPr>
+        <w:pStyle w:val="ListParagraph"/>
+        <w:numPr>
+          <w:ilvl w:val="0"/>
+          <w:numId w:val="2"/>
+        </w:numPr>
+        <w:spacing w:after="60"/>
+      </w:pPr>
+      <w:r>
+        <w:rPr>
+          <w:sz w:val="21"/>
+          <w:szCs w:val="21"/>
+        </w:rPr>
+        <w:t xml:space="preserve">Entity linking can false-positive on sentences that start with "Apple" the fruit.</w:t>
+      </w:r>
+    </w:p>
+    <w:p>
+      <w:pPr>
+        <w:pStyle w:val="ListParagraph"/>
+        <w:numPr>
+          <w:ilvl w:val="0"/>
+          <w:numId w:val="2"/>
+        </w:numPr>
+        <w:spacing w:after="60"/>
+      </w:pPr>
+      <w:r>
+        <w:rPr>
+          <w:sz w:val="21"/>
+          <w:szCs w:val="21"/>
+        </w:rPr>
+        <w:t xml:space="preserve">Intensifier vocabulary is small (for example, "absolutely" is not covered); any lexicon change must be measured on the dev split first.</w:t>
+      </w:r>
+    </w:p>
+    <w:p>
+      <w:pPr>
+        <w:pStyle w:val="ListParagraph"/>
+        <w:numPr>
+          <w:ilvl w:val="0"/>
+          <w:numId w:val="2"/>
+        </w:numPr>
+        <w:spacing w:after="60"/>
+      </w:pPr>
+      <w:r>
+        <w:rPr>
+          <w:sz w:val="21"/>
+          <w:szCs w:val="21"/>
+        </w:rPr>
+        <w:t xml:space="preserve">Stress shocks are illustrative, not regulator-calibrated; loans are marked to market rather than held at cost.</w:t>
       </w:r>
     </w:p>
     <w:p>
@@ -11228,7 +11557,7 @@
           <w:sz w:val="30"/>
           <w:szCs w:val="30"/>
         </w:rPr>
-        <w:t xml:space="preserve">12. Work plan (7 days)</w:t>
+        <w:t xml:space="preserve">12. Work plan (to the 10 Oct deadline)</w:t>
       </w:r>
     </w:p>
     <w:tbl>
@@ -11244,9 +11573,10 @@
         </w:tblBorders>
       </w:tblPr>
       <w:tblGrid>
-        <w:gridCol w:w="949"/>
-        <w:gridCol w:w="5218"/>
-        <w:gridCol w:w="3131"/>
+        <w:gridCol w:w="900"/>
+        <w:gridCol w:w="3859"/>
+        <w:gridCol w:w="1830"/>
+        <w:gridCol w:w="2709"/>
       </w:tblGrid>
       <w:tr>
         <w:trPr>
@@ -11255,7 +11585,7 @@
         </w:trPr>
         <w:tc>
           <w:tcPr>
-            <w:tcW w:type="dxa" w:w="949"/>
+            <w:tcW w:type="dxa" w:w="900"/>
             <w:tcBorders>
               <w:top w:val="single" w:color="B8C4D4" w:sz="4"/>
               <w:left w:val="single" w:color="B8C4D4" w:sz="4"/>
@@ -11288,7 +11618,7 @@
         </w:tc>
         <w:tc>
           <w:tcPr>
-            <w:tcW w:type="dxa" w:w="5218"/>
+            <w:tcW w:type="dxa" w:w="3859"/>
             <w:tcBorders>
               <w:top w:val="single" w:color="B8C4D4" w:sz="4"/>
               <w:left w:val="single" w:color="B8C4D4" w:sz="4"/>
@@ -11321,7 +11651,7 @@
         </w:tc>
         <w:tc>
           <w:tcPr>
-            <w:tcW w:type="dxa" w:w="3131"/>
+            <w:tcW w:type="dxa" w:w="1830"/>
             <w:tcBorders>
               <w:top w:val="single" w:color="B8C4D4" w:sz="4"/>
               <w:left w:val="single" w:color="B8C4D4" w:sz="4"/>
@@ -11349,6 +11679,39 @@
                 <w:szCs w:val="18"/>
               </w:rPr>
               <w:t xml:space="preserve">Done by</w:t>
+            </w:r>
+          </w:p>
+        </w:tc>
+        <w:tc>
+          <w:tcPr>
+            <w:tcW w:type="dxa" w:w="2709"/>
+            <w:tcBorders>
+              <w:top w:val="single" w:color="B8C4D4" w:sz="4"/>
+              <w:left w:val="single" w:color="B8C4D4" w:sz="4"/>
+              <w:bottom w:val="single" w:color="B8C4D4" w:sz="4"/>
+              <w:right w:val="single" w:color="B8C4D4" w:sz="4"/>
+            </w:tcBorders>
+            <w:shd w:fill="DCE6F2" w:color="auto" w:val="clear"/>
+            <w:tcMar>
+              <w:top w:type="dxa" w:w="60"/>
+              <w:left w:type="dxa" w:w="90"/>
+              <w:bottom w:type="dxa" w:w="60"/>
+              <w:right w:type="dxa" w:w="90"/>
+            </w:tcMar>
+          </w:tcPr>
+          <w:p>
+            <w:pPr>
+              <w:spacing w:after="0" w:line="252"/>
+            </w:pPr>
+            <w:r>
+              <w:rPr>
+                <w:b/>
+                <w:bCs/>
+                <w:color w:val="1F3A5F"/>
+                <w:sz w:val="18"/>
+                <w:szCs w:val="18"/>
+              </w:rPr>
+              <w:t xml:space="preserve">Status</w:t>
             </w:r>
           </w:p>
         </w:tc>
@@ -11359,7 +11722,7 @@
         </w:trPr>
         <w:tc>
           <w:tcPr>
-            <w:tcW w:type="dxa" w:w="949"/>
+            <w:tcW w:type="dxa" w:w="900"/>
             <w:tcBorders>
               <w:top w:val="single" w:color="B8C4D4" w:sz="4"/>
               <w:left w:val="single" w:color="B8C4D4" w:sz="4"/>
@@ -11390,63 +11753,94 @@
         </w:tc>
         <w:tc>
           <w:tcPr>
-            <w:tcW w:type="dxa" w:w="5218"/>
-            <w:tcBorders>
-              <w:top w:val="single" w:color="B8C4D4" w:sz="4"/>
-              <w:left w:val="single" w:color="B8C4D4" w:sz="4"/>
-              <w:bottom w:val="single" w:color="B8C4D4" w:sz="4"/>
-              <w:right w:val="single" w:color="B8C4D4" w:sz="4"/>
-            </w:tcBorders>
-            <w:tcMar>
-              <w:top w:type="dxa" w:w="60"/>
-              <w:left w:type="dxa" w:w="90"/>
-              <w:bottom w:type="dxa" w:w="60"/>
-              <w:right w:type="dxa" w:w="90"/>
-            </w:tcMar>
-          </w:tcPr>
-          <w:p>
-            <w:pPr>
-              <w:spacing w:after="0" w:line="252"/>
-            </w:pPr>
-            <w:r>
-              <w:rPr>
-                <w:b w:val="false"/>
-                <w:bCs w:val="false"/>
-                <w:sz w:val="18"/>
-                <w:szCs w:val="18"/>
-              </w:rPr>
-              <w:t xml:space="preserve">Agree this PRD; set up GitHub repo, MIT license, first commit; install Python and run the prototype</w:t>
-            </w:r>
-          </w:p>
-        </w:tc>
-        <w:tc>
-          <w:tcPr>
-            <w:tcW w:type="dxa" w:w="3131"/>
-            <w:tcBorders>
-              <w:top w:val="single" w:color="B8C4D4" w:sz="4"/>
-              <w:left w:val="single" w:color="B8C4D4" w:sz="4"/>
-              <w:bottom w:val="single" w:color="B8C4D4" w:sz="4"/>
-              <w:right w:val="single" w:color="B8C4D4" w:sz="4"/>
-            </w:tcBorders>
-            <w:tcMar>
-              <w:top w:type="dxa" w:w="60"/>
-              <w:left w:type="dxa" w:w="90"/>
-              <w:bottom w:type="dxa" w:w="60"/>
-              <w:right w:type="dxa" w:w="90"/>
-            </w:tcMar>
-          </w:tcPr>
-          <w:p>
-            <w:pPr>
-              <w:spacing w:after="0" w:line="252"/>
-            </w:pPr>
-            <w:r>
-              <w:rPr>
-                <w:b w:val="false"/>
-                <w:bCs w:val="false"/>
-                <w:sz w:val="18"/>
-                <w:szCs w:val="18"/>
-              </w:rPr>
-              <w:t xml:space="preserve">You</w:t>
+            <w:tcW w:type="dxa" w:w="3859"/>
+            <w:tcBorders>
+              <w:top w:val="single" w:color="B8C4D4" w:sz="4"/>
+              <w:left w:val="single" w:color="B8C4D4" w:sz="4"/>
+              <w:bottom w:val="single" w:color="B8C4D4" w:sz="4"/>
+              <w:right w:val="single" w:color="B8C4D4" w:sz="4"/>
+            </w:tcBorders>
+            <w:tcMar>
+              <w:top w:type="dxa" w:w="60"/>
+              <w:left w:type="dxa" w:w="90"/>
+              <w:bottom w:type="dxa" w:w="60"/>
+              <w:right w:type="dxa" w:w="90"/>
+            </w:tcMar>
+          </w:tcPr>
+          <w:p>
+            <w:pPr>
+              <w:spacing w:after="0" w:line="252"/>
+            </w:pPr>
+            <w:r>
+              <w:rPr>
+                <w:b w:val="false"/>
+                <w:bCs w:val="false"/>
+                <w:sz w:val="18"/>
+                <w:szCs w:val="18"/>
+              </w:rPr>
+              <w:t xml:space="preserve">PRD agreed; audit of the prototype; first bug fixes</w:t>
+            </w:r>
+          </w:p>
+        </w:tc>
+        <w:tc>
+          <w:tcPr>
+            <w:tcW w:type="dxa" w:w="1830"/>
+            <w:tcBorders>
+              <w:top w:val="single" w:color="B8C4D4" w:sz="4"/>
+              <w:left w:val="single" w:color="B8C4D4" w:sz="4"/>
+              <w:bottom w:val="single" w:color="B8C4D4" w:sz="4"/>
+              <w:right w:val="single" w:color="B8C4D4" w:sz="4"/>
+            </w:tcBorders>
+            <w:tcMar>
+              <w:top w:type="dxa" w:w="60"/>
+              <w:left w:type="dxa" w:w="90"/>
+              <w:bottom w:type="dxa" w:w="60"/>
+              <w:right w:type="dxa" w:w="90"/>
+            </w:tcMar>
+          </w:tcPr>
+          <w:p>
+            <w:pPr>
+              <w:spacing w:after="0" w:line="252"/>
+            </w:pPr>
+            <w:r>
+              <w:rPr>
+                <w:b w:val="false"/>
+                <w:bCs w:val="false"/>
+                <w:sz w:val="18"/>
+                <w:szCs w:val="18"/>
+              </w:rPr>
+              <w:t xml:space="preserve">Both</w:t>
+            </w:r>
+          </w:p>
+        </w:tc>
+        <w:tc>
+          <w:tcPr>
+            <w:tcW w:type="dxa" w:w="2709"/>
+            <w:tcBorders>
+              <w:top w:val="single" w:color="B8C4D4" w:sz="4"/>
+              <w:left w:val="single" w:color="B8C4D4" w:sz="4"/>
+              <w:bottom w:val="single" w:color="B8C4D4" w:sz="4"/>
+              <w:right w:val="single" w:color="B8C4D4" w:sz="4"/>
+            </w:tcBorders>
+            <w:tcMar>
+              <w:top w:type="dxa" w:w="60"/>
+              <w:left w:type="dxa" w:w="90"/>
+              <w:bottom w:type="dxa" w:w="60"/>
+              <w:right w:type="dxa" w:w="90"/>
+            </w:tcMar>
+          </w:tcPr>
+          <w:p>
+            <w:pPr>
+              <w:spacing w:after="0" w:line="252"/>
+            </w:pPr>
+            <w:r>
+              <w:rPr>
+                <w:b w:val="false"/>
+                <w:bCs w:val="false"/>
+                <w:sz w:val="18"/>
+                <w:szCs w:val="18"/>
+              </w:rPr>
+              <w:t xml:space="preserve">Done</w:t>
             </w:r>
           </w:p>
         </w:tc>
@@ -11457,7 +11851,7 @@
         </w:trPr>
         <w:tc>
           <w:tcPr>
-            <w:tcW w:type="dxa" w:w="949"/>
+            <w:tcW w:type="dxa" w:w="900"/>
             <w:tcBorders>
               <w:top w:val="single" w:color="B8C4D4" w:sz="4"/>
               <w:left w:val="single" w:color="B8C4D4" w:sz="4"/>
@@ -11488,32 +11882,32 @@
         </w:tc>
         <w:tc>
           <w:tcPr>
-            <w:tcW w:type="dxa" w:w="5218"/>
-            <w:tcBorders>
-              <w:top w:val="single" w:color="B8C4D4" w:sz="4"/>
-              <w:left w:val="single" w:color="B8C4D4" w:sz="4"/>
-              <w:bottom w:val="single" w:color="B8C4D4" w:sz="4"/>
-              <w:right w:val="single" w:color="B8C4D4" w:sz="4"/>
-            </w:tcBorders>
-            <w:tcMar>
-              <w:top w:type="dxa" w:w="60"/>
-              <w:left w:type="dxa" w:w="90"/>
-              <w:bottom w:type="dxa" w:w="60"/>
-              <w:right w:type="dxa" w:w="90"/>
-            </w:tcMar>
-          </w:tcPr>
-          <w:p>
-            <w:pPr>
-              <w:spacing w:after="0" w:line="252"/>
-            </w:pPr>
-            <w:r>
-              <w:rPr>
-                <w:b w:val="false"/>
-                <w:bCs w:val="false"/>
-                <w:sz w:val="18"/>
-                <w:szCs w:val="18"/>
-              </w:rPr>
-              <w:t xml:space="preserve">Move code into </w:t>
+            <w:tcW w:type="dxa" w:w="3859"/>
+            <w:tcBorders>
+              <w:top w:val="single" w:color="B8C4D4" w:sz="4"/>
+              <w:left w:val="single" w:color="B8C4D4" w:sz="4"/>
+              <w:bottom w:val="single" w:color="B8C4D4" w:sz="4"/>
+              <w:right w:val="single" w:color="B8C4D4" w:sz="4"/>
+            </w:tcBorders>
+            <w:tcMar>
+              <w:top w:type="dxa" w:w="60"/>
+              <w:left w:type="dxa" w:w="90"/>
+              <w:bottom w:type="dxa" w:w="60"/>
+              <w:right w:type="dxa" w:w="90"/>
+            </w:tcMar>
+          </w:tcPr>
+          <w:p>
+            <w:pPr>
+              <w:spacing w:after="0" w:line="252"/>
+            </w:pPr>
+            <w:r>
+              <w:rPr>
+                <w:b w:val="false"/>
+                <w:bCs w:val="false"/>
+                <w:sz w:val="18"/>
+                <w:szCs w:val="18"/>
+              </w:rPr>
+              <w:t xml:space="preserve">Restructure into </w:t>
             </w:r>
             <w:r>
               <w:rPr>
@@ -11533,78 +11927,69 @@
                 <w:sz w:val="18"/>
                 <w:szCs w:val="18"/>
               </w:rPr>
-              <w:t xml:space="preserve">; write </w:t>
-            </w:r>
-            <w:r>
-              <w:rPr>
-                <w:rFonts w:ascii="Consolas" w:cs="Consolas" w:eastAsia="Consolas" w:hAnsi="Consolas"/>
-                <w:b w:val="false"/>
-                <w:bCs w:val="false"/>
-                <w:sz w:val="16"/>
-                <w:szCs w:val="16"/>
-                <w:shd w:fill="EDEDED" w:color="auto" w:val="clear"/>
-              </w:rPr>
-              <w:t xml:space="preserve">requirements.txt</w:t>
-            </w:r>
-            <w:r>
-              <w:rPr>
-                <w:b w:val="false"/>
-                <w:bCs w:val="false"/>
-                <w:sz w:val="18"/>
-                <w:szCs w:val="18"/>
-              </w:rPr>
-              <w:t xml:space="preserve">; run and fix </w:t>
-            </w:r>
-            <w:r>
-              <w:rPr>
-                <w:rFonts w:ascii="Consolas" w:cs="Consolas" w:eastAsia="Consolas" w:hAnsi="Consolas"/>
-                <w:b w:val="false"/>
-                <w:bCs w:val="false"/>
-                <w:sz w:val="16"/>
-                <w:szCs w:val="16"/>
-                <w:shd w:fill="EDEDED" w:color="auto" w:val="clear"/>
-              </w:rPr>
-              <w:t xml:space="preserve">app.py</w:t>
-            </w:r>
-            <w:r>
-              <w:rPr>
-                <w:b w:val="false"/>
-                <w:bCs w:val="false"/>
-                <w:sz w:val="18"/>
-                <w:szCs w:val="18"/>
-              </w:rPr>
-              <w:t xml:space="preserve">; unit tests for NLP, rebalancer, stress</w:t>
-            </w:r>
-          </w:p>
-        </w:tc>
-        <w:tc>
-          <w:tcPr>
-            <w:tcW w:type="dxa" w:w="3131"/>
-            <w:tcBorders>
-              <w:top w:val="single" w:color="B8C4D4" w:sz="4"/>
-              <w:left w:val="single" w:color="B8C4D4" w:sz="4"/>
-              <w:bottom w:val="single" w:color="B8C4D4" w:sz="4"/>
-              <w:right w:val="single" w:color="B8C4D4" w:sz="4"/>
-            </w:tcBorders>
-            <w:tcMar>
-              <w:top w:type="dxa" w:w="60"/>
-              <w:left w:type="dxa" w:w="90"/>
-              <w:bottom w:type="dxa" w:w="60"/>
-              <w:right w:type="dxa" w:w="90"/>
-            </w:tcMar>
-          </w:tcPr>
-          <w:p>
-            <w:pPr>
-              <w:spacing w:after="0" w:line="252"/>
-            </w:pPr>
-            <w:r>
-              <w:rPr>
-                <w:b w:val="false"/>
-                <w:bCs w:val="false"/>
-                <w:sz w:val="18"/>
-                <w:szCs w:val="18"/>
-              </w:rPr>
-              <w:t xml:space="preserve">Agent, you review</w:t>
+              <w:t xml:space="preserve">, tests, dashboard, evaluation script, git history, README draft, architecture diagram; push to a public GitHub repo</w:t>
+            </w:r>
+          </w:p>
+        </w:tc>
+        <w:tc>
+          <w:tcPr>
+            <w:tcW w:type="dxa" w:w="1830"/>
+            <w:tcBorders>
+              <w:top w:val="single" w:color="B8C4D4" w:sz="4"/>
+              <w:left w:val="single" w:color="B8C4D4" w:sz="4"/>
+              <w:bottom w:val="single" w:color="B8C4D4" w:sz="4"/>
+              <w:right w:val="single" w:color="B8C4D4" w:sz="4"/>
+            </w:tcBorders>
+            <w:tcMar>
+              <w:top w:type="dxa" w:w="60"/>
+              <w:left w:type="dxa" w:w="90"/>
+              <w:bottom w:type="dxa" w:w="60"/>
+              <w:right w:type="dxa" w:w="90"/>
+            </w:tcMar>
+          </w:tcPr>
+          <w:p>
+            <w:pPr>
+              <w:spacing w:after="0" w:line="252"/>
+            </w:pPr>
+            <w:r>
+              <w:rPr>
+                <w:b w:val="false"/>
+                <w:bCs w:val="false"/>
+                <w:sz w:val="18"/>
+                <w:szCs w:val="18"/>
+              </w:rPr>
+              <w:t xml:space="preserve">Agent + you review</w:t>
+            </w:r>
+          </w:p>
+        </w:tc>
+        <w:tc>
+          <w:tcPr>
+            <w:tcW w:type="dxa" w:w="2709"/>
+            <w:tcBorders>
+              <w:top w:val="single" w:color="B8C4D4" w:sz="4"/>
+              <w:left w:val="single" w:color="B8C4D4" w:sz="4"/>
+              <w:bottom w:val="single" w:color="B8C4D4" w:sz="4"/>
+              <w:right w:val="single" w:color="B8C4D4" w:sz="4"/>
+            </w:tcBorders>
+            <w:tcMar>
+              <w:top w:type="dxa" w:w="60"/>
+              <w:left w:type="dxa" w:w="90"/>
+              <w:bottom w:type="dxa" w:w="60"/>
+              <w:right w:type="dxa" w:w="90"/>
+            </w:tcMar>
+          </w:tcPr>
+          <w:p>
+            <w:pPr>
+              <w:spacing w:after="0" w:line="252"/>
+            </w:pPr>
+            <w:r>
+              <w:rPr>
+                <w:b w:val="false"/>
+                <w:bCs w:val="false"/>
+                <w:sz w:val="18"/>
+                <w:szCs w:val="18"/>
+              </w:rPr>
+              <w:t xml:space="preserve">Mostly done; push and labeling remain</w:t>
             </w:r>
           </w:p>
         </w:tc>
@@ -11615,7 +12000,7 @@
         </w:trPr>
         <w:tc>
           <w:tcPr>
-            <w:tcW w:type="dxa" w:w="949"/>
+            <w:tcW w:type="dxa" w:w="900"/>
             <w:tcBorders>
               <w:top w:val="single" w:color="B8C4D4" w:sz="4"/>
               <w:left w:val="single" w:color="B8C4D4" w:sz="4"/>
@@ -11646,63 +12031,103 @@
         </w:tc>
         <w:tc>
           <w:tcPr>
-            <w:tcW w:type="dxa" w:w="5218"/>
-            <w:tcBorders>
-              <w:top w:val="single" w:color="B8C4D4" w:sz="4"/>
-              <w:left w:val="single" w:color="B8C4D4" w:sz="4"/>
-              <w:bottom w:val="single" w:color="B8C4D4" w:sz="4"/>
-              <w:right w:val="single" w:color="B8C4D4" w:sz="4"/>
-            </w:tcBorders>
-            <w:tcMar>
-              <w:top w:type="dxa" w:w="60"/>
-              <w:left w:type="dxa" w:w="90"/>
-              <w:bottom w:type="dxa" w:w="60"/>
-              <w:right w:type="dxa" w:w="90"/>
-            </w:tcMar>
-          </w:tcPr>
-          <w:p>
-            <w:pPr>
-              <w:spacing w:after="0" w:line="252"/>
-            </w:pPr>
-            <w:r>
-              <w:rPr>
-                <w:b w:val="false"/>
-                <w:bCs w:val="false"/>
-                <w:sz w:val="18"/>
-                <w:szCs w:val="18"/>
-              </w:rPr>
-              <w:t xml:space="preserve">Build dashboard (weights chart, stress before/after, signal feed, live analyze box)</w:t>
-            </w:r>
-          </w:p>
-        </w:tc>
-        <w:tc>
-          <w:tcPr>
-            <w:tcW w:type="dxa" w:w="3131"/>
-            <w:tcBorders>
-              <w:top w:val="single" w:color="B8C4D4" w:sz="4"/>
-              <w:left w:val="single" w:color="B8C4D4" w:sz="4"/>
-              <w:bottom w:val="single" w:color="B8C4D4" w:sz="4"/>
-              <w:right w:val="single" w:color="B8C4D4" w:sz="4"/>
-            </w:tcBorders>
-            <w:tcMar>
-              <w:top w:type="dxa" w:w="60"/>
-              <w:left w:type="dxa" w:w="90"/>
-              <w:bottom w:type="dxa" w:w="60"/>
-              <w:right w:type="dxa" w:w="90"/>
-            </w:tcMar>
-          </w:tcPr>
-          <w:p>
-            <w:pPr>
-              <w:spacing w:after="0" w:line="252"/>
-            </w:pPr>
-            <w:r>
-              <w:rPr>
-                <w:b w:val="false"/>
-                <w:bCs w:val="false"/>
-                <w:sz w:val="18"/>
-                <w:szCs w:val="18"/>
-              </w:rPr>
-              <w:t xml:space="preserve">Agent, you review</w:t>
+            <w:tcW w:type="dxa" w:w="3859"/>
+            <w:tcBorders>
+              <w:top w:val="single" w:color="B8C4D4" w:sz="4"/>
+              <w:left w:val="single" w:color="B8C4D4" w:sz="4"/>
+              <w:bottom w:val="single" w:color="B8C4D4" w:sz="4"/>
+              <w:right w:val="single" w:color="B8C4D4" w:sz="4"/>
+            </w:tcBorders>
+            <w:tcMar>
+              <w:top w:type="dxa" w:w="60"/>
+              <w:left w:type="dxa" w:w="90"/>
+              <w:bottom w:type="dxa" w:w="60"/>
+              <w:right w:type="dxa" w:w="90"/>
+            </w:tcMar>
+          </w:tcPr>
+          <w:p>
+            <w:pPr>
+              <w:spacing w:after="0" w:line="252"/>
+            </w:pPr>
+            <w:r>
+              <w:rPr>
+                <w:b w:val="false"/>
+                <w:bCs w:val="false"/>
+                <w:sz w:val="18"/>
+                <w:szCs w:val="18"/>
+              </w:rPr>
+              <w:t xml:space="preserve">Finish labeling 80-100 headlines; run the evaluation; tune only on the dev split; commit each real change</w:t>
+            </w:r>
+          </w:p>
+        </w:tc>
+        <w:tc>
+          <w:tcPr>
+            <w:tcW w:type="dxa" w:w="1830"/>
+            <w:tcBorders>
+              <w:top w:val="single" w:color="B8C4D4" w:sz="4"/>
+              <w:left w:val="single" w:color="B8C4D4" w:sz="4"/>
+              <w:bottom w:val="single" w:color="B8C4D4" w:sz="4"/>
+              <w:right w:val="single" w:color="B8C4D4" w:sz="4"/>
+            </w:tcBorders>
+            <w:tcMar>
+              <w:top w:type="dxa" w:w="60"/>
+              <w:left w:type="dxa" w:w="90"/>
+              <w:bottom w:type="dxa" w:w="60"/>
+              <w:right w:type="dxa" w:w="90"/>
+            </w:tcMar>
+          </w:tcPr>
+          <w:p>
+            <w:pPr>
+              <w:spacing w:after="0" w:line="252"/>
+            </w:pPr>
+            <w:r>
+              <w:rPr>
+                <w:b/>
+                <w:bCs/>
+                <w:sz w:val="18"/>
+                <w:szCs w:val="18"/>
+              </w:rPr>
+              <w:t xml:space="preserve">You</w:t>
+            </w:r>
+            <w:r>
+              <w:rPr>
+                <w:b w:val="false"/>
+                <w:bCs w:val="false"/>
+                <w:sz w:val="18"/>
+                <w:szCs w:val="18"/>
+              </w:rPr>
+              <w:t xml:space="preserve"> label, agent computes</w:t>
+            </w:r>
+          </w:p>
+        </w:tc>
+        <w:tc>
+          <w:tcPr>
+            <w:tcW w:type="dxa" w:w="2709"/>
+            <w:tcBorders>
+              <w:top w:val="single" w:color="B8C4D4" w:sz="4"/>
+              <w:left w:val="single" w:color="B8C4D4" w:sz="4"/>
+              <w:bottom w:val="single" w:color="B8C4D4" w:sz="4"/>
+              <w:right w:val="single" w:color="B8C4D4" w:sz="4"/>
+            </w:tcBorders>
+            <w:tcMar>
+              <w:top w:type="dxa" w:w="60"/>
+              <w:left w:type="dxa" w:w="90"/>
+              <w:bottom w:type="dxa" w:w="60"/>
+              <w:right w:type="dxa" w:w="90"/>
+            </w:tcMar>
+          </w:tcPr>
+          <w:p>
+            <w:pPr>
+              <w:spacing w:after="0" w:line="252"/>
+            </w:pPr>
+            <w:r>
+              <w:rPr>
+                <w:b w:val="false"/>
+                <w:bCs w:val="false"/>
+                <w:sz w:val="18"/>
+                <w:szCs w:val="18"/>
+              </w:rPr>
+              <w:t xml:space="preserve">Pending</w:t>
             </w:r>
           </w:p>
         </w:tc>
@@ -11713,7 +12138,7 @@
         </w:trPr>
         <w:tc>
           <w:tcPr>
-            <w:tcW w:type="dxa" w:w="949"/>
+            <w:tcW w:type="dxa" w:w="900"/>
             <w:tcBorders>
               <w:top w:val="single" w:color="B8C4D4" w:sz="4"/>
               <w:left w:val="single" w:color="B8C4D4" w:sz="4"/>
@@ -11744,72 +12169,94 @@
         </w:tc>
         <w:tc>
           <w:tcPr>
-            <w:tcW w:type="dxa" w:w="5218"/>
-            <w:tcBorders>
-              <w:top w:val="single" w:color="B8C4D4" w:sz="4"/>
-              <w:left w:val="single" w:color="B8C4D4" w:sz="4"/>
-              <w:bottom w:val="single" w:color="B8C4D4" w:sz="4"/>
-              <w:right w:val="single" w:color="B8C4D4" w:sz="4"/>
-            </w:tcBorders>
-            <w:tcMar>
-              <w:top w:type="dxa" w:w="60"/>
-              <w:left w:type="dxa" w:w="90"/>
-              <w:bottom w:type="dxa" w:w="60"/>
-              <w:right w:type="dxa" w:w="90"/>
-            </w:tcMar>
-          </w:tcPr>
-          <w:p>
-            <w:pPr>
-              <w:spacing w:after="0" w:line="252"/>
-            </w:pPr>
-            <w:r>
-              <w:rPr>
-                <w:b w:val="false"/>
-                <w:bCs w:val="false"/>
-                <w:sz w:val="18"/>
-                <w:szCs w:val="18"/>
-              </w:rPr>
-              <w:t xml:space="preserve">Label 50-100 headlines; run evaluation vs. baseline; tune lexicon if clearly warranted</w:t>
-            </w:r>
-          </w:p>
-        </w:tc>
-        <w:tc>
-          <w:tcPr>
-            <w:tcW w:type="dxa" w:w="3131"/>
-            <w:tcBorders>
-              <w:top w:val="single" w:color="B8C4D4" w:sz="4"/>
-              <w:left w:val="single" w:color="B8C4D4" w:sz="4"/>
-              <w:bottom w:val="single" w:color="B8C4D4" w:sz="4"/>
-              <w:right w:val="single" w:color="B8C4D4" w:sz="4"/>
-            </w:tcBorders>
-            <w:tcMar>
-              <w:top w:type="dxa" w:w="60"/>
-              <w:left w:type="dxa" w:w="90"/>
-              <w:bottom w:type="dxa" w:w="60"/>
-              <w:right w:type="dxa" w:w="90"/>
-            </w:tcMar>
-          </w:tcPr>
-          <w:p>
-            <w:pPr>
-              <w:spacing w:after="0" w:line="252"/>
-            </w:pPr>
-            <w:r>
-              <w:rPr>
-                <w:b/>
-                <w:bCs/>
-                <w:sz w:val="18"/>
-                <w:szCs w:val="18"/>
-              </w:rPr>
-              <w:t xml:space="preserve">You</w:t>
-            </w:r>
-            <w:r>
-              <w:rPr>
-                <w:b w:val="false"/>
-                <w:bCs w:val="false"/>
-                <w:sz w:val="18"/>
-                <w:szCs w:val="18"/>
-              </w:rPr>
-              <w:t xml:space="preserve"> label, agent computes metrics</w:t>
+            <w:tcW w:type="dxa" w:w="3859"/>
+            <w:tcBorders>
+              <w:top w:val="single" w:color="B8C4D4" w:sz="4"/>
+              <w:left w:val="single" w:color="B8C4D4" w:sz="4"/>
+              <w:bottom w:val="single" w:color="B8C4D4" w:sz="4"/>
+              <w:right w:val="single" w:color="B8C4D4" w:sz="4"/>
+            </w:tcBorders>
+            <w:tcMar>
+              <w:top w:type="dxa" w:w="60"/>
+              <w:left w:type="dxa" w:w="90"/>
+              <w:bottom w:type="dxa" w:w="60"/>
+              <w:right w:type="dxa" w:w="90"/>
+            </w:tcMar>
+          </w:tcPr>
+          <w:p>
+            <w:pPr>
+              <w:spacing w:after="0" w:line="252"/>
+            </w:pPr>
+            <w:r>
+              <w:rPr>
+                <w:b w:val="false"/>
+                <w:bCs w:val="false"/>
+                <w:sz w:val="18"/>
+                <w:szCs w:val="18"/>
+              </w:rPr>
+              <w:t xml:space="preserve">Freeze evaluation results; fill README numbers; final PRD pass</w:t>
+            </w:r>
+          </w:p>
+        </w:tc>
+        <w:tc>
+          <w:tcPr>
+            <w:tcW w:type="dxa" w:w="1830"/>
+            <w:tcBorders>
+              <w:top w:val="single" w:color="B8C4D4" w:sz="4"/>
+              <w:left w:val="single" w:color="B8C4D4" w:sz="4"/>
+              <w:bottom w:val="single" w:color="B8C4D4" w:sz="4"/>
+              <w:right w:val="single" w:color="B8C4D4" w:sz="4"/>
+            </w:tcBorders>
+            <w:tcMar>
+              <w:top w:type="dxa" w:w="60"/>
+              <w:left w:type="dxa" w:w="90"/>
+              <w:bottom w:type="dxa" w:w="60"/>
+              <w:right w:type="dxa" w:w="90"/>
+            </w:tcMar>
+          </w:tcPr>
+          <w:p>
+            <w:pPr>
+              <w:spacing w:after="0" w:line="252"/>
+            </w:pPr>
+            <w:r>
+              <w:rPr>
+                <w:b w:val="false"/>
+                <w:bCs w:val="false"/>
+                <w:sz w:val="18"/>
+                <w:szCs w:val="18"/>
+              </w:rPr>
+              <w:t xml:space="preserve">Both</w:t>
+            </w:r>
+          </w:p>
+        </w:tc>
+        <w:tc>
+          <w:tcPr>
+            <w:tcW w:type="dxa" w:w="2709"/>
+            <w:tcBorders>
+              <w:top w:val="single" w:color="B8C4D4" w:sz="4"/>
+              <w:left w:val="single" w:color="B8C4D4" w:sz="4"/>
+              <w:bottom w:val="single" w:color="B8C4D4" w:sz="4"/>
+              <w:right w:val="single" w:color="B8C4D4" w:sz="4"/>
+            </w:tcBorders>
+            <w:tcMar>
+              <w:top w:type="dxa" w:w="60"/>
+              <w:left w:type="dxa" w:w="90"/>
+              <w:bottom w:type="dxa" w:w="60"/>
+              <w:right w:type="dxa" w:w="90"/>
+            </w:tcMar>
+          </w:tcPr>
+          <w:p>
+            <w:pPr>
+              <w:spacing w:after="0" w:line="252"/>
+            </w:pPr>
+            <w:r>
+              <w:rPr>
+                <w:b w:val="false"/>
+                <w:bCs w:val="false"/>
+                <w:sz w:val="18"/>
+                <w:szCs w:val="18"/>
+              </w:rPr>
+              <w:t xml:space="preserve">Pending</w:t>
             </w:r>
           </w:p>
         </w:tc>
@@ -11820,7 +12267,7 @@
         </w:trPr>
         <w:tc>
           <w:tcPr>
-            <w:tcW w:type="dxa" w:w="949"/>
+            <w:tcW w:type="dxa" w:w="900"/>
             <w:tcBorders>
               <w:top w:val="single" w:color="B8C4D4" w:sz="4"/>
               <w:left w:val="single" w:color="B8C4D4" w:sz="4"/>
@@ -11851,38 +12298,58 @@
         </w:tc>
         <w:tc>
           <w:tcPr>
-            <w:tcW w:type="dxa" w:w="5218"/>
-            <w:tcBorders>
-              <w:top w:val="single" w:color="B8C4D4" w:sz="4"/>
-              <w:left w:val="single" w:color="B8C4D4" w:sz="4"/>
-              <w:bottom w:val="single" w:color="B8C4D4" w:sz="4"/>
-              <w:right w:val="single" w:color="B8C4D4" w:sz="4"/>
-            </w:tcBorders>
-            <w:tcMar>
-              <w:top w:type="dxa" w:w="60"/>
-              <w:left w:type="dxa" w:w="90"/>
-              <w:bottom w:type="dxa" w:w="60"/>
-              <w:right w:type="dxa" w:w="90"/>
-            </w:tcMar>
-          </w:tcPr>
-          <w:p>
-            <w:pPr>
-              <w:spacing w:after="0" w:line="252"/>
-            </w:pPr>
-            <w:r>
-              <w:rPr>
-                <w:b w:val="false"/>
-                <w:bCs w:val="false"/>
-                <w:sz w:val="18"/>
-                <w:szCs w:val="18"/>
-              </w:rPr>
-              <w:t xml:space="preserve">README (full template), architecture diagram PNG, deck draft</w:t>
-            </w:r>
-          </w:p>
-        </w:tc>
-        <w:tc>
-          <w:tcPr>
-            <w:tcW w:type="dxa" w:w="3131"/>
+            <w:tcW w:type="dxa" w:w="3859"/>
+            <w:tcBorders>
+              <w:top w:val="single" w:color="B8C4D4" w:sz="4"/>
+              <w:left w:val="single" w:color="B8C4D4" w:sz="4"/>
+              <w:bottom w:val="single" w:color="B8C4D4" w:sz="4"/>
+              <w:right w:val="single" w:color="B8C4D4" w:sz="4"/>
+            </w:tcBorders>
+            <w:tcMar>
+              <w:top w:type="dxa" w:w="60"/>
+              <w:left w:type="dxa" w:w="90"/>
+              <w:bottom w:type="dxa" w:w="60"/>
+              <w:right w:type="dxa" w:w="90"/>
+            </w:tcMar>
+          </w:tcPr>
+          <w:p>
+            <w:pPr>
+              <w:spacing w:after="0" w:line="252"/>
+            </w:pPr>
+            <w:r>
+              <w:rPr>
+                <w:b w:val="false"/>
+                <w:bCs w:val="false"/>
+                <w:sz w:val="18"/>
+                <w:szCs w:val="18"/>
+              </w:rPr>
+              <w:t xml:space="preserve">Deck draft (5-7 slides, PDF in </w:t>
+            </w:r>
+            <w:r>
+              <w:rPr>
+                <w:rFonts w:ascii="Consolas" w:cs="Consolas" w:eastAsia="Consolas" w:hAnsi="Consolas"/>
+                <w:b w:val="false"/>
+                <w:bCs w:val="false"/>
+                <w:sz w:val="16"/>
+                <w:szCs w:val="16"/>
+                <w:shd w:fill="EDEDED" w:color="auto" w:val="clear"/>
+              </w:rPr>
+              <w:t xml:space="preserve">docs/</w:t>
+            </w:r>
+            <w:r>
+              <w:rPr>
+                <w:b w:val="false"/>
+                <w:bCs w:val="false"/>
+                <w:sz w:val="18"/>
+                <w:szCs w:val="18"/>
+              </w:rPr>
+              <w:t xml:space="preserve">); rehearse the demo twice</w:t>
+            </w:r>
+          </w:p>
+        </w:tc>
+        <w:tc>
+          <w:tcPr>
+            <w:tcW w:type="dxa" w:w="1830"/>
             <w:tcBorders>
               <w:top w:val="single" w:color="B8C4D4" w:sz="4"/>
               <w:left w:val="single" w:color="B8C4D4" w:sz="4"/>
@@ -11908,6 +12375,37 @@
                 <w:szCs w:val="18"/>
               </w:rPr>
               <w:t xml:space="preserve">Both</w:t>
+            </w:r>
+          </w:p>
+        </w:tc>
+        <w:tc>
+          <w:tcPr>
+            <w:tcW w:type="dxa" w:w="2709"/>
+            <w:tcBorders>
+              <w:top w:val="single" w:color="B8C4D4" w:sz="4"/>
+              <w:left w:val="single" w:color="B8C4D4" w:sz="4"/>
+              <w:bottom w:val="single" w:color="B8C4D4" w:sz="4"/>
+              <w:right w:val="single" w:color="B8C4D4" w:sz="4"/>
+            </w:tcBorders>
+            <w:tcMar>
+              <w:top w:type="dxa" w:w="60"/>
+              <w:left w:type="dxa" w:w="90"/>
+              <w:bottom w:type="dxa" w:w="60"/>
+              <w:right w:type="dxa" w:w="90"/>
+            </w:tcMar>
+          </w:tcPr>
+          <w:p>
+            <w:pPr>
+              <w:spacing w:after="0" w:line="252"/>
+            </w:pPr>
+            <w:r>
+              <w:rPr>
+                <w:b w:val="false"/>
+                <w:bCs w:val="false"/>
+                <w:sz w:val="18"/>
+                <w:szCs w:val="18"/>
+              </w:rPr>
+              <w:t xml:space="preserve">Pending</w:t>
             </w:r>
           </w:p>
         </w:tc>
@@ -11918,7 +12416,7 @@
         </w:trPr>
         <w:tc>
           <w:tcPr>
-            <w:tcW w:type="dxa" w:w="949"/>
+            <w:tcW w:type="dxa" w:w="900"/>
             <w:tcBorders>
               <w:top w:val="single" w:color="B8C4D4" w:sz="4"/>
               <w:left w:val="single" w:color="B8C4D4" w:sz="4"/>
@@ -11949,38 +12447,38 @@
         </w:tc>
         <w:tc>
           <w:tcPr>
-            <w:tcW w:type="dxa" w:w="5218"/>
-            <w:tcBorders>
-              <w:top w:val="single" w:color="B8C4D4" w:sz="4"/>
-              <w:left w:val="single" w:color="B8C4D4" w:sz="4"/>
-              <w:bottom w:val="single" w:color="B8C4D4" w:sz="4"/>
-              <w:right w:val="single" w:color="B8C4D4" w:sz="4"/>
-            </w:tcBorders>
-            <w:tcMar>
-              <w:top w:type="dxa" w:w="60"/>
-              <w:left w:type="dxa" w:w="90"/>
-              <w:bottom w:type="dxa" w:w="60"/>
-              <w:right w:type="dxa" w:w="90"/>
-            </w:tcMar>
-          </w:tcPr>
-          <w:p>
-            <w:pPr>
-              <w:spacing w:after="0" w:line="252"/>
-            </w:pPr>
-            <w:r>
-              <w:rPr>
-                <w:b w:val="false"/>
-                <w:bCs w:val="false"/>
-                <w:sz w:val="18"/>
-                <w:szCs w:val="18"/>
-              </w:rPr>
-              <w:t xml:space="preserve">Finish deck PDF; rehearse; record video; upload as YouTube unlisted; test in incognito</w:t>
-            </w:r>
-          </w:p>
-        </w:tc>
-        <w:tc>
-          <w:tcPr>
-            <w:tcW w:type="dxa" w:w="3131"/>
+            <w:tcW w:type="dxa" w:w="3859"/>
+            <w:tcBorders>
+              <w:top w:val="single" w:color="B8C4D4" w:sz="4"/>
+              <w:left w:val="single" w:color="B8C4D4" w:sz="4"/>
+              <w:bottom w:val="single" w:color="B8C4D4" w:sz="4"/>
+              <w:right w:val="single" w:color="B8C4D4" w:sz="4"/>
+            </w:tcBorders>
+            <w:tcMar>
+              <w:top w:type="dxa" w:w="60"/>
+              <w:left w:type="dxa" w:w="90"/>
+              <w:bottom w:type="dxa" w:w="60"/>
+              <w:right w:type="dxa" w:w="90"/>
+            </w:tcMar>
+          </w:tcPr>
+          <w:p>
+            <w:pPr>
+              <w:spacing w:after="0" w:line="252"/>
+            </w:pPr>
+            <w:r>
+              <w:rPr>
+                <w:b w:val="false"/>
+                <w:bCs w:val="false"/>
+                <w:sz w:val="18"/>
+                <w:szCs w:val="18"/>
+              </w:rPr>
+              <w:t xml:space="preserve">Record the demo (4-5 min), upload to YouTube as unlisted, test in incognito, add link to README</w:t>
+            </w:r>
+          </w:p>
+        </w:tc>
+        <w:tc>
+          <w:tcPr>
+            <w:tcW w:type="dxa" w:w="1830"/>
             <w:tcBorders>
               <w:top w:val="single" w:color="B8C4D4" w:sz="4"/>
               <w:left w:val="single" w:color="B8C4D4" w:sz="4"/>
@@ -12006,6 +12504,37 @@
                 <w:szCs w:val="18"/>
               </w:rPr>
               <w:t xml:space="preserve">You</w:t>
+            </w:r>
+          </w:p>
+        </w:tc>
+        <w:tc>
+          <w:tcPr>
+            <w:tcW w:type="dxa" w:w="2709"/>
+            <w:tcBorders>
+              <w:top w:val="single" w:color="B8C4D4" w:sz="4"/>
+              <w:left w:val="single" w:color="B8C4D4" w:sz="4"/>
+              <w:bottom w:val="single" w:color="B8C4D4" w:sz="4"/>
+              <w:right w:val="single" w:color="B8C4D4" w:sz="4"/>
+            </w:tcBorders>
+            <w:tcMar>
+              <w:top w:type="dxa" w:w="60"/>
+              <w:left w:type="dxa" w:w="90"/>
+              <w:bottom w:type="dxa" w:w="60"/>
+              <w:right w:type="dxa" w:w="90"/>
+            </w:tcMar>
+          </w:tcPr>
+          <w:p>
+            <w:pPr>
+              <w:spacing w:after="0" w:line="252"/>
+            </w:pPr>
+            <w:r>
+              <w:rPr>
+                <w:b w:val="false"/>
+                <w:bCs w:val="false"/>
+                <w:sz w:val="18"/>
+                <w:szCs w:val="18"/>
+              </w:rPr>
+              <w:t xml:space="preserve">Pending</w:t>
             </w:r>
           </w:p>
         </w:tc>
@@ -12016,7 +12545,7 @@
         </w:trPr>
         <w:tc>
           <w:tcPr>
-            <w:tcW w:type="dxa" w:w="949"/>
+            <w:tcW w:type="dxa" w:w="900"/>
             <w:tcBorders>
               <w:top w:val="single" w:color="B8C4D4" w:sz="4"/>
               <w:left w:val="single" w:color="B8C4D4" w:sz="4"/>
@@ -12047,38 +12576,38 @@
         </w:tc>
         <w:tc>
           <w:tcPr>
-            <w:tcW w:type="dxa" w:w="5218"/>
-            <w:tcBorders>
-              <w:top w:val="single" w:color="B8C4D4" w:sz="4"/>
-              <w:left w:val="single" w:color="B8C4D4" w:sz="4"/>
-              <w:bottom w:val="single" w:color="B8C4D4" w:sz="4"/>
-              <w:right w:val="single" w:color="B8C4D4" w:sz="4"/>
-            </w:tcBorders>
-            <w:tcMar>
-              <w:top w:type="dxa" w:w="60"/>
-              <w:left w:type="dxa" w:w="90"/>
-              <w:bottom w:type="dxa" w:w="60"/>
-              <w:right w:type="dxa" w:w="90"/>
-            </w:tcMar>
-          </w:tcPr>
-          <w:p>
-            <w:pPr>
-              <w:spacing w:after="0" w:line="252"/>
-            </w:pPr>
-            <w:r>
-              <w:rPr>
-                <w:b w:val="false"/>
-                <w:bCs w:val="false"/>
-                <w:sz w:val="18"/>
-                <w:szCs w:val="18"/>
-              </w:rPr>
-              <w:t xml:space="preserve">Fresh-clone test on a clean folder; check all links; submit via the official form</w:t>
-            </w:r>
-          </w:p>
-        </w:tc>
-        <w:tc>
-          <w:tcPr>
-            <w:tcW w:type="dxa" w:w="3131"/>
+            <w:tcW w:type="dxa" w:w="3859"/>
+            <w:tcBorders>
+              <w:top w:val="single" w:color="B8C4D4" w:sz="4"/>
+              <w:left w:val="single" w:color="B8C4D4" w:sz="4"/>
+              <w:bottom w:val="single" w:color="B8C4D4" w:sz="4"/>
+              <w:right w:val="single" w:color="B8C4D4" w:sz="4"/>
+            </w:tcBorders>
+            <w:tcMar>
+              <w:top w:type="dxa" w:w="60"/>
+              <w:left w:type="dxa" w:w="90"/>
+              <w:bottom w:type="dxa" w:w="60"/>
+              <w:right w:type="dxa" w:w="90"/>
+            </w:tcMar>
+          </w:tcPr>
+          <w:p>
+            <w:pPr>
+              <w:spacing w:after="0" w:line="252"/>
+            </w:pPr>
+            <w:r>
+              <w:rPr>
+                <w:b w:val="false"/>
+                <w:bCs w:val="false"/>
+                <w:sz w:val="18"/>
+                <w:szCs w:val="18"/>
+              </w:rPr>
+              <w:t xml:space="preserve">Fresh-clone test, check all links in incognito, submit through the official form</w:t>
+            </w:r>
+          </w:p>
+        </w:tc>
+        <w:tc>
+          <w:tcPr>
+            <w:tcW w:type="dxa" w:w="1830"/>
             <w:tcBorders>
               <w:top w:val="single" w:color="B8C4D4" w:sz="4"/>
               <w:left w:val="single" w:color="B8C4D4" w:sz="4"/>
@@ -12104,6 +12633,37 @@
                 <w:szCs w:val="18"/>
               </w:rPr>
               <w:t xml:space="preserve">You</w:t>
+            </w:r>
+          </w:p>
+        </w:tc>
+        <w:tc>
+          <w:tcPr>
+            <w:tcW w:type="dxa" w:w="2709"/>
+            <w:tcBorders>
+              <w:top w:val="single" w:color="B8C4D4" w:sz="4"/>
+              <w:left w:val="single" w:color="B8C4D4" w:sz="4"/>
+              <w:bottom w:val="single" w:color="B8C4D4" w:sz="4"/>
+              <w:right w:val="single" w:color="B8C4D4" w:sz="4"/>
+            </w:tcBorders>
+            <w:tcMar>
+              <w:top w:type="dxa" w:w="60"/>
+              <w:left w:type="dxa" w:w="90"/>
+              <w:bottom w:type="dxa" w:w="60"/>
+              <w:right w:type="dxa" w:w="90"/>
+            </w:tcMar>
+          </w:tcPr>
+          <w:p>
+            <w:pPr>
+              <w:spacing w:after="0" w:line="252"/>
+            </w:pPr>
+            <w:r>
+              <w:rPr>
+                <w:b w:val="false"/>
+                <w:bCs w:val="false"/>
+                <w:sz w:val="18"/>
+                <w:szCs w:val="18"/>
+              </w:rPr>
+              <w:t xml:space="preserve">Pending</w:t>
             </w:r>
           </w:p>
         </w:tc>
@@ -12114,7 +12674,7 @@
         </w:trPr>
         <w:tc>
           <w:tcPr>
-            <w:tcW w:type="dxa" w:w="949"/>
+            <w:tcW w:type="dxa" w:w="900"/>
             <w:tcBorders>
               <w:top w:val="single" w:color="B8C4D4" w:sz="4"/>
               <w:left w:val="single" w:color="B8C4D4" w:sz="4"/>
@@ -12145,7 +12705,7 @@
         </w:tc>
         <w:tc>
           <w:tcPr>
-            <w:tcW w:type="dxa" w:w="5218"/>
+            <w:tcW w:type="dxa" w:w="3859"/>
             <w:tcBorders>
               <w:top w:val="single" w:color="B8C4D4" w:sz="4"/>
               <w:left w:val="single" w:color="B8C4D4" w:sz="4"/>
@@ -12176,7 +12736,29 @@
         </w:tc>
         <w:tc>
           <w:tcPr>
-            <w:tcW w:type="dxa" w:w="3131"/>
+            <w:tcW w:type="dxa" w:w="1830"/>
+            <w:tcBorders>
+              <w:top w:val="single" w:color="B8C4D4" w:sz="4"/>
+              <w:left w:val="single" w:color="B8C4D4" w:sz="4"/>
+              <w:bottom w:val="single" w:color="B8C4D4" w:sz="4"/>
+              <w:right w:val="single" w:color="B8C4D4" w:sz="4"/>
+            </w:tcBorders>
+            <w:tcMar>
+              <w:top w:type="dxa" w:w="60"/>
+              <w:left w:type="dxa" w:w="90"/>
+              <w:bottom w:type="dxa" w:w="60"/>
+              <w:right w:type="dxa" w:w="90"/>
+            </w:tcMar>
+          </w:tcPr>
+          <w:p>
+            <w:pPr>
+              <w:spacing w:after="0" w:line="252"/>
+            </w:pPr>
+          </w:p>
+        </w:tc>
+        <w:tc>
+          <w:tcPr>
+            <w:tcW w:type="dxa" w:w="2709"/>
             <w:tcBorders>
               <w:top w:val="single" w:color="B8C4D4" w:sz="4"/>
               <w:left w:val="single" w:color="B8C4D4" w:sz="4"/>
@@ -12212,7 +12794,7 @@
           <w:sz w:val="21"/>
           <w:szCs w:val="21"/>
         </w:rPr>
-        <w:t xml:space="preserve">Commit after each task with a clear message so history shows the build.</w:t>
+        <w:t xml:space="preserve">Commit after each real change with a clear message so the history shows genuine progress.</w:t>
       </w:r>
     </w:p>
     <w:p>
@@ -13224,14 +13806,46 @@
           <w:sz w:val="21"/>
           <w:szCs w:val="21"/>
         </w:rPr>
-        <w:t xml:space="preserve">Q1:</w:t>
-      </w:r>
-      <w:r>
-        <w:rPr>
-          <w:sz w:val="21"/>
-          <w:szCs w:val="21"/>
-        </w:rPr>
-        <w:t xml:space="preserve"> Exact repo name format and whether the organizers will accept the college prefix as written.</w:t>
+        <w:t xml:space="preserve">Q1 (resolved):</w:t>
+      </w:r>
+      <w:r>
+        <w:rPr>
+          <w:sz w:val="21"/>
+          <w:szCs w:val="21"/>
+        </w:rPr>
+        <w:t xml:space="preserve"> Repo name is </w:t>
+      </w:r>
+      <w:r>
+        <w:rPr>
+          <w:rFonts w:ascii="Consolas" w:cs="Consolas" w:eastAsia="Consolas" w:hAnsi="Consolas"/>
+          <w:sz w:val="19"/>
+          <w:szCs w:val="19"/>
+          <w:shd w:fill="EDEDED" w:color="auto" w:val="clear"/>
+        </w:rPr>
+        <w:t xml:space="preserve">iiitranchi-medhansh-poojari-hackathon</w:t>
+      </w:r>
+      <w:r>
+        <w:rPr>
+          <w:sz w:val="21"/>
+          <w:szCs w:val="21"/>
+        </w:rPr>
+        <w:t xml:space="preserve">, following the </w:t>
+      </w:r>
+      <w:r>
+        <w:rPr>
+          <w:rFonts w:ascii="Consolas" w:cs="Consolas" w:eastAsia="Consolas" w:hAnsi="Consolas"/>
+          <w:sz w:val="19"/>
+          <w:szCs w:val="19"/>
+          <w:shd w:fill="EDEDED" w:color="auto" w:val="clear"/>
+        </w:rPr>
+        <w:t xml:space="preserve">&lt;college&gt;-&lt;candidate-name&gt;-hackathon</w:t>
+      </w:r>
+      <w:r>
+        <w:rPr>
+          <w:sz w:val="21"/>
+          <w:szCs w:val="21"/>
+        </w:rPr>
+        <w:t xml:space="preserve"> convention.</w:t>
       </w:r>
     </w:p>
     <w:p>
@@ -13250,14 +13864,14 @@
           <w:sz w:val="21"/>
           <w:szCs w:val="21"/>
         </w:rPr>
-        <w:t xml:space="preserve">Q2:</w:t>
-      </w:r>
-      <w:r>
-        <w:rPr>
-          <w:sz w:val="21"/>
-          <w:szCs w:val="21"/>
-        </w:rPr>
-        <w:t xml:space="preserve"> Are the organizers' open-source dataset list and "provided sample transaction data" available anywhere?</w:t>
+        <w:t xml:space="preserve">Q2 (open):</w:t>
+      </w:r>
+      <w:r>
+        <w:rPr>
+          <w:sz w:val="21"/>
+          <w:szCs w:val="21"/>
+        </w:rPr>
+        <w:t xml:space="preserve"> Are the organizers' open-source dataset list and "provided sample transaction data" available anywhere? The portfolio is synthetic until they reply.</w:t>
       </w:r>
     </w:p>
     <w:p>
@@ -13276,7 +13890,7 @@
           <w:sz w:val="21"/>
           <w:szCs w:val="21"/>
         </w:rPr>
-        <w:t xml:space="preserve">Q3:</w:t>
+        <w:t xml:space="preserve">Q3 (open):</w:t>
       </w:r>
       <w:r>
         <w:rPr>
@@ -13302,14 +13916,14 @@
           <w:sz w:val="21"/>
           <w:szCs w:val="21"/>
         </w:rPr>
-        <w:t xml:space="preserve">Q4:</w:t>
-      </w:r>
-      <w:r>
-        <w:rPr>
-          <w:sz w:val="21"/>
-          <w:szCs w:val="21"/>
-        </w:rPr>
-        <w:t xml:space="preserve"> Candidate's Python version and OS, for the README "tested on" line.</w:t>
+        <w:t xml:space="preserve">Q4 (resolved):</w:t>
+      </w:r>
+      <w:r>
+        <w:rPr>
+          <w:sz w:val="21"/>
+          <w:szCs w:val="21"/>
+        </w:rPr>
+        <w:t xml:space="preserve"> Python 3.14.2 on Windows (PowerShell).</w:t>
       </w:r>
     </w:p>
     <w:p>
@@ -13328,14 +13942,14 @@
           <w:sz w:val="21"/>
           <w:szCs w:val="21"/>
         </w:rPr>
-        <w:t xml:space="preserve">Q5:</w:t>
-      </w:r>
-      <w:r>
-        <w:rPr>
-          <w:sz w:val="21"/>
-          <w:szCs w:val="21"/>
-        </w:rPr>
-        <w:t xml:space="preserve"> Is the video limit 5 or 10 minutes?</w:t>
+        <w:t xml:space="preserve">Q5 (open):</w:t>
+      </w:r>
+      <w:r>
+        <w:rPr>
+          <w:sz w:val="21"/>
+          <w:szCs w:val="21"/>
+        </w:rPr>
+        <w:t xml:space="preserve"> Is the video limit 5 or 10 minutes? Recording 4-5 minutes satisfies both documents.</w:t>
       </w:r>
     </w:p>
     <w:p>

</xml_diff>